<commit_message>
fix: restore Android page recognition and runtime diagnostics
</commit_message>
<xml_diff>
--- a/android-app/docs/手机端使用与测试指南.docx
+++ b/android-app/docs/手机端使用与测试指南.docx
@@ -9,7 +9,7 @@
       </w:pPr>
       <w:r>
         <w:rPr>
-          <w:rFonts w:ascii="Aptos" w:hAnsi="Aptos" w:eastAsia="PingFang SC"/>
+          <w:rFonts w:ascii="Aptos" w:hAnsi="Aptos" w:eastAsia="Hiragino Sans GB"/>
           <w:b/>
           <w:color w:val="1F4E78"/>
           <w:sz w:val="56"/>
@@ -24,7 +24,7 @@
       </w:pPr>
       <w:r>
         <w:rPr>
-          <w:rFonts w:ascii="Aptos" w:hAnsi="Aptos" w:eastAsia="PingFang SC"/>
+          <w:rFonts w:ascii="Aptos" w:hAnsi="Aptos" w:eastAsia="Hiragino Sans GB"/>
           <w:b/>
           <w:color w:val="24292F"/>
           <w:sz w:val="40"/>
@@ -39,7 +39,7 @@
       </w:pPr>
       <w:r>
         <w:rPr>
-          <w:rFonts w:ascii="Aptos" w:hAnsi="Aptos" w:eastAsia="PingFang SC"/>
+          <w:rFonts w:ascii="Aptos" w:hAnsi="Aptos" w:eastAsia="Hiragino Sans GB"/>
           <w:color w:val="57606A"/>
           <w:sz w:val="22"/>
         </w:rPr>
@@ -57,7 +57,7 @@
       </w:pPr>
       <w:r>
         <w:rPr>
-          <w:rFonts w:ascii="Aptos" w:hAnsi="Aptos" w:eastAsia="PingFang SC"/>
+          <w:rFonts w:ascii="Aptos" w:hAnsi="Aptos" w:eastAsia="Hiragino Sans GB"/>
           <w:b/>
           <w:color w:val="B42318"/>
           <w:sz w:val="21"/>
@@ -72,7 +72,7 @@
       </w:pPr>
       <w:r>
         <w:rPr>
-          <w:rFonts w:ascii="Aptos" w:hAnsi="Aptos" w:eastAsia="PingFang SC"/>
+          <w:rFonts w:ascii="Aptos" w:hAnsi="Aptos" w:eastAsia="Hiragino Sans GB"/>
           <w:color w:val="57606A"/>
           <w:sz w:val="19"/>
         </w:rPr>
@@ -87,7 +87,7 @@
       </w:pPr>
       <w:r>
         <w:rPr>
-          <w:rFonts w:ascii="Aptos" w:hAnsi="Aptos" w:eastAsia="PingFang SC"/>
+          <w:rFonts w:ascii="Aptos" w:hAnsi="Aptos" w:eastAsia="Hiragino Sans GB"/>
           <w:b/>
           <w:color w:val="1F4E78"/>
           <w:sz w:val="32"/>
@@ -101,7 +101,7 @@
       </w:pPr>
       <w:r>
         <w:rPr>
-          <w:rFonts w:ascii="Aptos" w:hAnsi="Aptos" w:eastAsia="PingFang SC"/>
+          <w:rFonts w:ascii="Aptos" w:hAnsi="Aptos" w:eastAsia="Hiragino Sans GB"/>
           <w:color w:val="24292F"/>
           <w:sz w:val="21"/>
         </w:rPr>
@@ -109,20 +109,20 @@
       </w:r>
       <w:r>
         <w:rPr>
-          <w:rFonts w:ascii="Aptos" w:hAnsi="Aptos" w:eastAsia="PingFang SC"/>
+          <w:rFonts w:ascii="Aptos" w:hAnsi="Aptos" w:eastAsia="Hiragino Sans GB"/>
           <w:b/>
           <w:color w:val="24292F"/>
           <w:sz w:val="21"/>
         </w:rPr>
-        <w:t>手动打开大麦以后</w:t>
+        <w:t>手动打开大麦并点击悬浮“开始”以后</w:t>
       </w:r>
       <w:r>
         <w:rPr>
-          <w:rFonts w:ascii="Aptos" w:hAnsi="Aptos" w:eastAsia="PingFang SC"/>
+          <w:rFonts w:ascii="Aptos" w:hAnsi="Aptos" w:eastAsia="Hiragino Sans GB"/>
           <w:color w:val="24292F"/>
           <w:sz w:val="21"/>
         </w:rPr>
-        <w:t>，识别已经确认过的项目、场次、票档和数量， 并在页面完全匹配时执行有限的点击。</w:t>
+        <w:t>，按演出日期和票档价格识别页面，并在页面完全匹配时执行有限的点击。</w:t>
       </w:r>
     </w:p>
     <w:p>
@@ -131,7 +131,7 @@
       </w:pPr>
       <w:r>
         <w:rPr>
-          <w:rFonts w:ascii="Aptos" w:hAnsi="Aptos" w:eastAsia="PingFang SC"/>
+          <w:rFonts w:ascii="Aptos" w:hAnsi="Aptos" w:eastAsia="Hiragino Sans GB"/>
           <w:color w:val="24292F"/>
           <w:sz w:val="21"/>
         </w:rPr>
@@ -145,7 +145,7 @@
       </w:pPr>
       <w:r>
         <w:rPr>
-          <w:rFonts w:ascii="Aptos" w:hAnsi="Aptos" w:eastAsia="PingFang SC"/>
+          <w:rFonts w:ascii="Aptos" w:hAnsi="Aptos" w:eastAsia="Hiragino Sans GB"/>
           <w:b w:val="0"/>
           <w:color w:val="24292F"/>
           <w:sz w:val="21"/>
@@ -154,7 +154,7 @@
       </w:r>
       <w:r>
         <w:rPr>
-          <w:rFonts w:ascii="Aptos" w:hAnsi="Aptos" w:eastAsia="PingFang SC"/>
+          <w:rFonts w:ascii="Aptos" w:hAnsi="Aptos" w:eastAsia="Hiragino Sans GB"/>
           <w:color w:val="24292F"/>
           <w:sz w:val="21"/>
         </w:rPr>
@@ -168,7 +168,7 @@
       </w:pPr>
       <w:r>
         <w:rPr>
-          <w:rFonts w:ascii="Aptos" w:hAnsi="Aptos" w:eastAsia="PingFang SC"/>
+          <w:rFonts w:ascii="Aptos" w:hAnsi="Aptos" w:eastAsia="Hiragino Sans GB"/>
           <w:b w:val="0"/>
           <w:color w:val="24292F"/>
           <w:sz w:val="21"/>
@@ -177,7 +177,7 @@
       </w:r>
       <w:r>
         <w:rPr>
-          <w:rFonts w:ascii="Aptos" w:hAnsi="Aptos" w:eastAsia="PingFang SC"/>
+          <w:rFonts w:ascii="Aptos" w:hAnsi="Aptos" w:eastAsia="Hiragino Sans GB"/>
           <w:color w:val="24292F"/>
           <w:sz w:val="21"/>
         </w:rPr>
@@ -191,7 +191,7 @@
       </w:pPr>
       <w:r>
         <w:rPr>
-          <w:rFonts w:ascii="Aptos" w:hAnsi="Aptos" w:eastAsia="PingFang SC"/>
+          <w:rFonts w:ascii="Aptos" w:hAnsi="Aptos" w:eastAsia="Hiragino Sans GB"/>
           <w:b w:val="0"/>
           <w:color w:val="24292F"/>
           <w:sz w:val="21"/>
@@ -200,7 +200,7 @@
       </w:r>
       <w:r>
         <w:rPr>
-          <w:rFonts w:ascii="Aptos" w:hAnsi="Aptos" w:eastAsia="PingFang SC"/>
+          <w:rFonts w:ascii="Aptos" w:hAnsi="Aptos" w:eastAsia="Hiragino Sans GB"/>
           <w:color w:val="24292F"/>
           <w:sz w:val="21"/>
         </w:rPr>
@@ -214,7 +214,7 @@
       </w:pPr>
       <w:r>
         <w:rPr>
-          <w:rFonts w:ascii="Aptos" w:hAnsi="Aptos" w:eastAsia="PingFang SC"/>
+          <w:rFonts w:ascii="Aptos" w:hAnsi="Aptos" w:eastAsia="Hiragino Sans GB"/>
           <w:b w:val="0"/>
           <w:color w:val="24292F"/>
           <w:sz w:val="21"/>
@@ -223,7 +223,7 @@
       </w:r>
       <w:r>
         <w:rPr>
-          <w:rFonts w:ascii="Aptos" w:hAnsi="Aptos" w:eastAsia="PingFang SC"/>
+          <w:rFonts w:ascii="Aptos" w:hAnsi="Aptos" w:eastAsia="Hiragino Sans GB"/>
           <w:color w:val="24292F"/>
           <w:sz w:val="21"/>
         </w:rPr>
@@ -236,7 +236,7 @@
       </w:pPr>
       <w:r>
         <w:rPr>
-          <w:rFonts w:ascii="Aptos" w:hAnsi="Aptos" w:eastAsia="PingFang SC"/>
+          <w:rFonts w:ascii="Aptos" w:hAnsi="Aptos" w:eastAsia="Hiragino Sans GB"/>
           <w:color w:val="24292F"/>
           <w:sz w:val="21"/>
         </w:rPr>
@@ -251,12 +251,12 @@
       </w:pPr>
       <w:r>
         <w:rPr>
-          <w:rFonts w:ascii="Aptos" w:hAnsi="Aptos" w:eastAsia="PingFang SC"/>
+          <w:rFonts w:ascii="Aptos" w:hAnsi="Aptos" w:eastAsia="Hiragino Sans GB"/>
           <w:b/>
           <w:color w:val="1F4E78"/>
           <w:sz w:val="32"/>
         </w:rPr>
-        <w:t>实际界面示意</w:t>
+        <w:t>实际界面示意（当前版本）</w:t>
       </w:r>
     </w:p>
     <w:p>
@@ -265,11 +265,11 @@
       </w:pPr>
       <w:r>
         <w:rPr>
-          <w:rFonts w:ascii="Aptos" w:hAnsi="Aptos" w:eastAsia="PingFang SC"/>
+          <w:rFonts w:ascii="Aptos" w:hAnsi="Aptos" w:eastAsia="Hiragino Sans GB"/>
           <w:color w:val="57606A"/>
           <w:sz w:val="19"/>
         </w:rPr>
-        <w:t>不同手机的状态栏和桌面外观会略有不同，应用内容和控制方式一致。</w:t>
+        <w:t>配置页只填写日期与票档价格；保存后需手动打开大麦并点击悬浮“开始”。</w:t>
       </w:r>
     </w:p>
     <w:tbl>
@@ -426,12 +426,12 @@
             </w:pPr>
             <w:r>
               <w:rPr>
-                <w:rFonts w:ascii="Aptos" w:hAnsi="Aptos" w:eastAsia="PingFang SC"/>
+                <w:rFonts w:ascii="Aptos" w:hAnsi="Aptos" w:eastAsia="Hiragino Sans GB"/>
                 <w:b/>
                 <w:color w:val="57606A"/>
                 <w:sz w:val="18"/>
               </w:rPr>
-              <w:t>配置页面：填写目标、开启权限并开始</w:t>
+              <w:t>配置页面：选择模式、日期、价格并完成授权</w:t>
             </w:r>
           </w:p>
         </w:tc>
@@ -459,12 +459,12 @@
             </w:pPr>
             <w:r>
               <w:rPr>
-                <w:rFonts w:ascii="Aptos" w:hAnsi="Aptos" w:eastAsia="PingFang SC"/>
+                <w:rFonts w:ascii="Aptos" w:hAnsi="Aptos" w:eastAsia="Hiragino Sans GB"/>
                 <w:b/>
                 <w:color w:val="57606A"/>
                 <w:sz w:val="18"/>
               </w:rPr>
-              <w:t>运行状态：左上角日志与“停止”按钮</w:t>
+              <w:t>悬浮控件：点击“开始”前显示引导日志，并可随时“停止”</w:t>
             </w:r>
           </w:p>
         </w:tc>
@@ -477,7 +477,7 @@
       </w:pPr>
       <w:r>
         <w:rPr>
-          <w:rFonts w:ascii="Aptos" w:hAnsi="Aptos" w:eastAsia="PingFang SC"/>
+          <w:rFonts w:ascii="Aptos" w:hAnsi="Aptos" w:eastAsia="Hiragino Sans GB"/>
           <w:b/>
           <w:color w:val="1F4E78"/>
           <w:sz w:val="32"/>
@@ -492,7 +492,7 @@
       </w:pPr>
       <w:r>
         <w:rPr>
-          <w:rFonts w:ascii="Aptos" w:hAnsi="Aptos" w:eastAsia="PingFang SC"/>
+          <w:rFonts w:ascii="Aptos" w:hAnsi="Aptos" w:eastAsia="Hiragino Sans GB"/>
           <w:b/>
           <w:color w:val="1F4E78"/>
           <w:sz w:val="21"/>
@@ -501,7 +501,7 @@
       </w:r>
       <w:r>
         <w:rPr>
-          <w:rFonts w:ascii="Aptos" w:hAnsi="Aptos" w:eastAsia="PingFang SC"/>
+          <w:rFonts w:ascii="Aptos" w:hAnsi="Aptos" w:eastAsia="Hiragino Sans GB"/>
           <w:color w:val="24292F"/>
           <w:sz w:val="21"/>
         </w:rPr>
@@ -515,7 +515,7 @@
       </w:pPr>
       <w:r>
         <w:rPr>
-          <w:rFonts w:ascii="Aptos" w:hAnsi="Aptos" w:eastAsia="PingFang SC"/>
+          <w:rFonts w:ascii="Aptos" w:hAnsi="Aptos" w:eastAsia="Hiragino Sans GB"/>
           <w:b/>
           <w:color w:val="1F4E78"/>
           <w:sz w:val="21"/>
@@ -524,7 +524,7 @@
       </w:r>
       <w:r>
         <w:rPr>
-          <w:rFonts w:ascii="Aptos" w:hAnsi="Aptos" w:eastAsia="PingFang SC"/>
+          <w:rFonts w:ascii="Aptos" w:hAnsi="Aptos" w:eastAsia="Hiragino Sans GB"/>
           <w:color w:val="24292F"/>
           <w:sz w:val="21"/>
         </w:rPr>
@@ -538,7 +538,7 @@
       </w:pPr>
       <w:r>
         <w:rPr>
-          <w:rFonts w:ascii="Aptos" w:hAnsi="Aptos" w:eastAsia="PingFang SC"/>
+          <w:rFonts w:ascii="Aptos" w:hAnsi="Aptos" w:eastAsia="Hiragino Sans GB"/>
           <w:b/>
           <w:color w:val="1F4E78"/>
           <w:sz w:val="21"/>
@@ -547,7 +547,7 @@
       </w:r>
       <w:r>
         <w:rPr>
-          <w:rFonts w:ascii="Aptos" w:hAnsi="Aptos" w:eastAsia="PingFang SC"/>
+          <w:rFonts w:ascii="Aptos" w:hAnsi="Aptos" w:eastAsia="Hiragino Sans GB"/>
           <w:color w:val="24292F"/>
           <w:sz w:val="21"/>
         </w:rPr>
@@ -561,7 +561,7 @@
       </w:pPr>
       <w:r>
         <w:rPr>
-          <w:rFonts w:ascii="Aptos" w:hAnsi="Aptos" w:eastAsia="PingFang SC"/>
+          <w:rFonts w:ascii="Aptos" w:hAnsi="Aptos" w:eastAsia="Hiragino Sans GB"/>
           <w:b/>
           <w:color w:val="1F4E78"/>
           <w:sz w:val="21"/>
@@ -570,28 +570,11 @@
       </w:r>
       <w:r>
         <w:rPr>
-          <w:rFonts w:ascii="Aptos" w:hAnsi="Aptos" w:eastAsia="PingFang SC"/>
+          <w:rFonts w:ascii="Aptos" w:hAnsi="Aptos" w:eastAsia="Hiragino Sans GB"/>
           <w:color w:val="24292F"/>
           <w:sz w:val="21"/>
         </w:rPr>
-        <w:t xml:space="preserve">首次测试建议把“最大提交次数”设置为 </w:t>
-      </w:r>
-      <w:r>
-        <w:rPr>
-          <w:rFonts w:ascii="Aptos" w:hAnsi="Aptos" w:eastAsia="Menlo"/>
-          <w:color w:val="9C2B2E"/>
-          <w:sz w:val="21"/>
-          <w:highlight/>
-        </w:rPr>
-        <w:t>1</w:t>
-      </w:r>
-      <w:r>
-        <w:rPr>
-          <w:rFonts w:ascii="Aptos" w:hAnsi="Aptos" w:eastAsia="PingFang SC"/>
-          <w:color w:val="24292F"/>
-          <w:sz w:val="21"/>
-        </w:rPr>
-        <w:t>。</w:t>
+        <w:t>首次测试建议先选“只抢票”，并确认自己能随时点击悬浮“停止”。</w:t>
       </w:r>
     </w:p>
     <w:p>
@@ -601,7 +584,7 @@
       </w:pPr>
       <w:r>
         <w:rPr>
-          <w:rFonts w:ascii="Aptos" w:hAnsi="Aptos" w:eastAsia="PingFang SC"/>
+          <w:rFonts w:ascii="Aptos" w:hAnsi="Aptos" w:eastAsia="Hiragino Sans GB"/>
           <w:b/>
           <w:color w:val="1F4E78"/>
           <w:sz w:val="21"/>
@@ -610,7 +593,7 @@
       </w:r>
       <w:r>
         <w:rPr>
-          <w:rFonts w:ascii="Aptos" w:hAnsi="Aptos" w:eastAsia="PingFang SC"/>
+          <w:rFonts w:ascii="Aptos" w:hAnsi="Aptos" w:eastAsia="Hiragino Sans GB"/>
           <w:color w:val="24292F"/>
           <w:sz w:val="21"/>
         </w:rPr>
@@ -624,7 +607,7 @@
       </w:pPr>
       <w:r>
         <w:rPr>
-          <w:rFonts w:ascii="Aptos" w:hAnsi="Aptos" w:eastAsia="PingFang SC"/>
+          <w:rFonts w:ascii="Aptos" w:hAnsi="Aptos" w:eastAsia="Hiragino Sans GB"/>
           <w:b/>
           <w:color w:val="1F4E78"/>
           <w:sz w:val="32"/>
@@ -639,7 +622,7 @@
       </w:pPr>
       <w:r>
         <w:rPr>
-          <w:rFonts w:ascii="Aptos" w:hAnsi="Aptos" w:eastAsia="PingFang SC"/>
+          <w:rFonts w:ascii="Aptos" w:hAnsi="Aptos" w:eastAsia="Hiragino Sans GB"/>
           <w:b/>
           <w:color w:val="1F4E78"/>
           <w:sz w:val="26"/>
@@ -654,7 +637,7 @@
       </w:pPr>
       <w:r>
         <w:rPr>
-          <w:rFonts w:ascii="Aptos" w:hAnsi="Aptos" w:eastAsia="PingFang SC"/>
+          <w:rFonts w:ascii="Aptos" w:hAnsi="Aptos" w:eastAsia="Hiragino Sans GB"/>
           <w:b/>
           <w:color w:val="1F4E78"/>
           <w:sz w:val="21"/>
@@ -663,7 +646,7 @@
       </w:r>
       <w:r>
         <w:rPr>
-          <w:rFonts w:ascii="Aptos" w:hAnsi="Aptos" w:eastAsia="PingFang SC"/>
+          <w:rFonts w:ascii="Aptos" w:hAnsi="Aptos" w:eastAsia="Hiragino Sans GB"/>
           <w:color w:val="24292F"/>
           <w:sz w:val="21"/>
         </w:rPr>
@@ -677,7 +660,7 @@
       </w:pPr>
       <w:r>
         <w:rPr>
-          <w:rFonts w:ascii="Aptos" w:hAnsi="Aptos" w:eastAsia="PingFang SC"/>
+          <w:rFonts w:ascii="Aptos" w:hAnsi="Aptos" w:eastAsia="Hiragino Sans GB"/>
           <w:b/>
           <w:color w:val="1F4E78"/>
           <w:sz w:val="21"/>
@@ -686,7 +669,7 @@
       </w:r>
       <w:r>
         <w:rPr>
-          <w:rFonts w:ascii="Aptos" w:hAnsi="Aptos" w:eastAsia="PingFang SC"/>
+          <w:rFonts w:ascii="Aptos" w:hAnsi="Aptos" w:eastAsia="Hiragino Sans GB"/>
           <w:color w:val="24292F"/>
           <w:sz w:val="21"/>
         </w:rPr>
@@ -700,7 +683,7 @@
       </w:pPr>
       <w:r>
         <w:rPr>
-          <w:rFonts w:ascii="Aptos" w:hAnsi="Aptos" w:eastAsia="PingFang SC"/>
+          <w:rFonts w:ascii="Aptos" w:hAnsi="Aptos" w:eastAsia="Hiragino Sans GB"/>
           <w:b/>
           <w:color w:val="1F4E78"/>
           <w:sz w:val="21"/>
@@ -709,7 +692,7 @@
       </w:r>
       <w:r>
         <w:rPr>
-          <w:rFonts w:ascii="Aptos" w:hAnsi="Aptos" w:eastAsia="PingFang SC"/>
+          <w:rFonts w:ascii="Aptos" w:hAnsi="Aptos" w:eastAsia="Hiragino Sans GB"/>
           <w:color w:val="24292F"/>
           <w:sz w:val="21"/>
         </w:rPr>
@@ -723,7 +706,7 @@
       </w:pPr>
       <w:r>
         <w:rPr>
-          <w:rFonts w:ascii="Aptos" w:hAnsi="Aptos" w:eastAsia="PingFang SC"/>
+          <w:rFonts w:ascii="Aptos" w:hAnsi="Aptos" w:eastAsia="Hiragino Sans GB"/>
           <w:b/>
           <w:color w:val="1F4E78"/>
           <w:sz w:val="21"/>
@@ -732,11 +715,11 @@
       </w:r>
       <w:r>
         <w:rPr>
-          <w:rFonts w:ascii="Aptos" w:hAnsi="Aptos" w:eastAsia="PingFang SC"/>
+          <w:rFonts w:ascii="Aptos" w:hAnsi="Aptos" w:eastAsia="Hiragino Sans GB"/>
           <w:color w:val="24292F"/>
           <w:sz w:val="21"/>
         </w:rPr>
-        <w:t>返回应用，确认页面显示“无障碍服务：已开启”。</w:t>
+        <w:t>返回应用，确认页面显示“无障碍服务 · 已开启”。</w:t>
       </w:r>
     </w:p>
     <w:p>
@@ -745,7 +728,7 @@
       </w:pPr>
       <w:r>
         <w:rPr>
-          <w:rFonts w:ascii="Aptos" w:hAnsi="Aptos" w:eastAsia="PingFang SC"/>
+          <w:rFonts w:ascii="Aptos" w:hAnsi="Aptos" w:eastAsia="Hiragino Sans GB"/>
           <w:color w:val="24292F"/>
           <w:sz w:val="21"/>
         </w:rPr>
@@ -759,7 +742,7 @@
       </w:pPr>
       <w:r>
         <w:rPr>
-          <w:rFonts w:ascii="Aptos" w:hAnsi="Aptos" w:eastAsia="PingFang SC"/>
+          <w:rFonts w:ascii="Aptos" w:hAnsi="Aptos" w:eastAsia="Hiragino Sans GB"/>
           <w:b/>
           <w:color w:val="1F4E78"/>
           <w:sz w:val="26"/>
@@ -773,7 +756,7 @@
       </w:pPr>
       <w:r>
         <w:rPr>
-          <w:rFonts w:ascii="Aptos" w:hAnsi="Aptos" w:eastAsia="PingFang SC"/>
+          <w:rFonts w:ascii="Aptos" w:hAnsi="Aptos" w:eastAsia="Hiragino Sans GB"/>
           <w:color w:val="24292F"/>
           <w:sz w:val="21"/>
         </w:rPr>
@@ -786,7 +769,7 @@
       </w:pPr>
       <w:r>
         <w:rPr>
-          <w:rFonts w:ascii="Aptos" w:hAnsi="Aptos" w:eastAsia="PingFang SC"/>
+          <w:rFonts w:ascii="Aptos" w:hAnsi="Aptos" w:eastAsia="Hiragino Sans GB"/>
           <w:color w:val="24292F"/>
           <w:sz w:val="21"/>
         </w:rPr>
@@ -800,7 +783,7 @@
       </w:pPr>
       <w:r>
         <w:rPr>
-          <w:rFonts w:ascii="Aptos" w:hAnsi="Aptos" w:eastAsia="PingFang SC"/>
+          <w:rFonts w:ascii="Aptos" w:hAnsi="Aptos" w:eastAsia="Hiragino Sans GB"/>
           <w:b/>
           <w:color w:val="1F4E78"/>
           <w:sz w:val="32"/>
@@ -814,11 +797,11 @@
       </w:pPr>
       <w:r>
         <w:rPr>
-          <w:rFonts w:ascii="Aptos" w:hAnsi="Aptos" w:eastAsia="PingFang SC"/>
+          <w:rFonts w:ascii="Aptos" w:hAnsi="Aptos" w:eastAsia="Hiragino Sans GB"/>
           <w:color w:val="24292F"/>
           <w:sz w:val="21"/>
         </w:rPr>
-        <w:t>以下内容必须和大麦中的设置保持一致：</w:t>
+        <w:t>购票辅助只填写演出日期和票档价格；场次、数量和实名观演人仍在大麦中配置。</w:t>
       </w:r>
     </w:p>
     <w:tbl>
@@ -859,7 +842,7 @@
             </w:pPr>
             <w:r>
               <w:rPr>
-                <w:rFonts w:ascii="Aptos" w:hAnsi="Aptos" w:eastAsia="PingFang SC"/>
+                <w:rFonts w:ascii="Aptos" w:hAnsi="Aptos" w:eastAsia="Hiragino Sans GB"/>
                 <w:b/>
                 <w:color w:val="24292F"/>
                 <w:sz w:val="19"/>
@@ -894,7 +877,7 @@
             </w:pPr>
             <w:r>
               <w:rPr>
-                <w:rFonts w:ascii="Aptos" w:hAnsi="Aptos" w:eastAsia="PingFang SC"/>
+                <w:rFonts w:ascii="Aptos" w:hAnsi="Aptos" w:eastAsia="Hiragino Sans GB"/>
                 <w:b/>
                 <w:color w:val="24292F"/>
                 <w:sz w:val="19"/>
@@ -930,12 +913,12 @@
             </w:pPr>
             <w:r>
               <w:rPr>
-                <w:rFonts w:ascii="Aptos" w:hAnsi="Aptos" w:eastAsia="PingFang SC"/>
+                <w:rFonts w:ascii="Aptos" w:hAnsi="Aptos" w:eastAsia="Hiragino Sans GB"/>
                 <w:b w:val="0"/>
                 <w:color w:val="24292F"/>
                 <w:sz w:val="19"/>
               </w:rPr>
-              <w:t>项目识别关键词</w:t>
+              <w:t>运行模式</w:t>
             </w:r>
           </w:p>
         </w:tc>
@@ -964,12 +947,12 @@
             </w:pPr>
             <w:r>
               <w:rPr>
-                <w:rFonts w:ascii="Aptos" w:hAnsi="Aptos" w:eastAsia="PingFang SC"/>
+                <w:rFonts w:ascii="Aptos" w:hAnsi="Aptos" w:eastAsia="Hiragino Sans GB"/>
                 <w:b w:val="0"/>
                 <w:color w:val="24292F"/>
                 <w:sz w:val="19"/>
               </w:rPr>
-              <w:t>填写项目页面上稳定出现的名称或关键词</w:t>
+              <w:t>选择“只抢票”“只抢回流”或“抢票后接回流”</w:t>
             </w:r>
           </w:p>
         </w:tc>
@@ -1000,12 +983,12 @@
             </w:pPr>
             <w:r>
               <w:rPr>
-                <w:rFonts w:ascii="Aptos" w:hAnsi="Aptos" w:eastAsia="PingFang SC"/>
+                <w:rFonts w:ascii="Aptos" w:hAnsi="Aptos" w:eastAsia="Hiragino Sans GB"/>
                 <w:b w:val="0"/>
                 <w:color w:val="24292F"/>
                 <w:sz w:val="19"/>
               </w:rPr>
-              <w:t>目标场次</w:t>
+              <w:t>演出日期</w:t>
             </w:r>
           </w:p>
         </w:tc>
@@ -1034,12 +1017,12 @@
             </w:pPr>
             <w:r>
               <w:rPr>
-                <w:rFonts w:ascii="Aptos" w:hAnsi="Aptos" w:eastAsia="PingFang SC"/>
+                <w:rFonts w:ascii="Aptos" w:hAnsi="Aptos" w:eastAsia="Hiragino Sans GB"/>
                 <w:b w:val="0"/>
                 <w:color w:val="24292F"/>
                 <w:sz w:val="19"/>
               </w:rPr>
-              <w:t>按大麦页面显示填写</w:t>
+              <w:t>点击日期选择器；完整年月日或中文 8月17日均可识别</w:t>
             </w:r>
           </w:p>
         </w:tc>
@@ -1070,12 +1053,12 @@
             </w:pPr>
             <w:r>
               <w:rPr>
-                <w:rFonts w:ascii="Aptos" w:hAnsi="Aptos" w:eastAsia="PingFang SC"/>
+                <w:rFonts w:ascii="Aptos" w:hAnsi="Aptos" w:eastAsia="Hiragino Sans GB"/>
                 <w:b w:val="0"/>
                 <w:color w:val="24292F"/>
                 <w:sz w:val="19"/>
               </w:rPr>
-              <w:t>目标票档名称</w:t>
+              <w:t>无年份数字日期</w:t>
             </w:r>
           </w:p>
         </w:tc>
@@ -1104,12 +1087,12 @@
             </w:pPr>
             <w:r>
               <w:rPr>
-                <w:rFonts w:ascii="Aptos" w:hAnsi="Aptos" w:eastAsia="PingFang SC"/>
+                <w:rFonts w:ascii="Aptos" w:hAnsi="Aptos" w:eastAsia="Hiragino Sans GB"/>
                 <w:b w:val="0"/>
                 <w:color w:val="24292F"/>
                 <w:sz w:val="19"/>
               </w:rPr>
-              <w:t>按大麦页面显示填写</w:t>
+              <w:t>必须是双位 MM-DD、MM/DD 或 MM.DD</w:t>
             </w:r>
           </w:p>
         </w:tc>
@@ -1140,12 +1123,12 @@
             </w:pPr>
             <w:r>
               <w:rPr>
-                <w:rFonts w:ascii="Aptos" w:hAnsi="Aptos" w:eastAsia="PingFang SC"/>
+                <w:rFonts w:ascii="Aptos" w:hAnsi="Aptos" w:eastAsia="Hiragino Sans GB"/>
                 <w:b w:val="0"/>
                 <w:color w:val="24292F"/>
                 <w:sz w:val="19"/>
               </w:rPr>
-              <w:t>目标单价</w:t>
+              <w:t>票档价格</w:t>
             </w:r>
           </w:p>
         </w:tc>
@@ -1174,12 +1157,12 @@
             </w:pPr>
             <w:r>
               <w:rPr>
-                <w:rFonts w:ascii="Aptos" w:hAnsi="Aptos" w:eastAsia="PingFang SC"/>
+                <w:rFonts w:ascii="Aptos" w:hAnsi="Aptos" w:eastAsia="Hiragino Sans GB"/>
                 <w:b w:val="0"/>
                 <w:color w:val="24292F"/>
                 <w:sz w:val="19"/>
               </w:rPr>
-              <w:t>填单张价格，单位是元</w:t>
+              <w:t>只填数字，单位为元，例如 580</w:t>
             </w:r>
           </w:p>
         </w:tc>
@@ -1210,12 +1193,12 @@
             </w:pPr>
             <w:r>
               <w:rPr>
-                <w:rFonts w:ascii="Aptos" w:hAnsi="Aptos" w:eastAsia="PingFang SC"/>
+                <w:rFonts w:ascii="Aptos" w:hAnsi="Aptos" w:eastAsia="Hiragino Sans GB"/>
                 <w:b w:val="0"/>
                 <w:color w:val="24292F"/>
                 <w:sz w:val="19"/>
               </w:rPr>
-              <w:t>购票数量</w:t>
+              <w:t>大麦侧设置</w:t>
             </w:r>
           </w:p>
         </w:tc>
@@ -1244,12 +1227,12 @@
             </w:pPr>
             <w:r>
               <w:rPr>
-                <w:rFonts w:ascii="Aptos" w:hAnsi="Aptos" w:eastAsia="PingFang SC"/>
+                <w:rFonts w:ascii="Aptos" w:hAnsi="Aptos" w:eastAsia="Hiragino Sans GB"/>
                 <w:b w:val="0"/>
                 <w:color w:val="24292F"/>
                 <w:sz w:val="19"/>
               </w:rPr>
-              <w:t>填实际需要的数量</w:t>
+              <w:t>提前选好场次、票档、数量和实名观演人</w:t>
             </w:r>
           </w:p>
         </w:tc>
@@ -1280,12 +1263,12 @@
             </w:pPr>
             <w:r>
               <w:rPr>
-                <w:rFonts w:ascii="Aptos" w:hAnsi="Aptos" w:eastAsia="PingFang SC"/>
+                <w:rFonts w:ascii="Aptos" w:hAnsi="Aptos" w:eastAsia="Hiragino Sans GB"/>
                 <w:b w:val="0"/>
                 <w:color w:val="24292F"/>
                 <w:sz w:val="19"/>
               </w:rPr>
-              <w:t>最大提交次数</w:t>
+              <w:t>自动操作边界</w:t>
             </w:r>
           </w:p>
         </w:tc>
@@ -1314,12 +1297,12 @@
             </w:pPr>
             <w:r>
               <w:rPr>
-                <w:rFonts w:ascii="Aptos" w:hAnsi="Aptos" w:eastAsia="PingFang SC"/>
+                <w:rFonts w:ascii="Aptos" w:hAnsi="Aptos" w:eastAsia="Hiragino Sans GB"/>
                 <w:b w:val="0"/>
                 <w:color w:val="24292F"/>
                 <w:sz w:val="19"/>
               </w:rPr>
-              <w:t>第一次测试建议填 1</w:t>
+              <w:t>无次数或时长输入项；到付款页、用户停止或安全暂停后不再自动点击</w:t>
             </w:r>
           </w:p>
         </w:tc>
@@ -1350,12 +1333,12 @@
             </w:pPr>
             <w:r>
               <w:rPr>
-                <w:rFonts w:ascii="Aptos" w:hAnsi="Aptos" w:eastAsia="PingFang SC"/>
+                <w:rFonts w:ascii="Aptos" w:hAnsi="Aptos" w:eastAsia="Hiragino Sans GB"/>
                 <w:b w:val="0"/>
                 <w:color w:val="24292F"/>
                 <w:sz w:val="19"/>
               </w:rPr>
-              <w:t>最长运行</w:t>
+              <w:t>隐私边界</w:t>
             </w:r>
           </w:p>
         </w:tc>
@@ -1384,12 +1367,12 @@
             </w:pPr>
             <w:r>
               <w:rPr>
-                <w:rFonts w:ascii="Aptos" w:hAnsi="Aptos" w:eastAsia="PingFang SC"/>
+                <w:rFonts w:ascii="Aptos" w:hAnsi="Aptos" w:eastAsia="Hiragino Sans GB"/>
                 <w:b w:val="0"/>
                 <w:color w:val="24292F"/>
                 <w:sz w:val="19"/>
               </w:rPr>
-              <w:t>第一次测试建议填 5 分钟</w:t>
+              <w:t>不保存账号、实名信息或支付资料</w:t>
             </w:r>
           </w:p>
         </w:tc>
@@ -1406,11 +1389,11 @@
       </w:pPr>
       <w:r>
         <w:rPr>
-          <w:rFonts w:ascii="Aptos" w:hAnsi="Aptos" w:eastAsia="PingFang SC"/>
+          <w:rFonts w:ascii="Aptos" w:hAnsi="Aptos" w:eastAsia="Hiragino Sans GB"/>
           <w:color w:val="24292F"/>
           <w:sz w:val="21"/>
         </w:rPr>
-        <w:t>确认已经在大麦中配置完成后，勾选：</w:t>
+        <w:t>开始前请先在大麦完成场次、票档、数量和实名观演人设置。</w:t>
       </w:r>
     </w:p>
     <w:p>
@@ -1419,11 +1402,11 @@
       </w:pPr>
       <w:r>
         <w:rPr>
-          <w:rFonts w:ascii="Aptos" w:hAnsi="Aptos" w:eastAsia="PingFang SC"/>
+          <w:rFonts w:ascii="Aptos" w:hAnsi="Aptos" w:eastAsia="Hiragino Sans GB"/>
           <w:color w:val="24292F"/>
           <w:sz w:val="21"/>
         </w:rPr>
-        <w:t>“我已在大麦中配置目标场次、票档、数量和实名观演人”。</w:t>
+        <w:t>应用不会读取或保存实名资料，只使用日期和票档价格做页面校验。</w:t>
       </w:r>
     </w:p>
     <w:p>
@@ -1433,7 +1416,7 @@
       </w:pPr>
       <w:r>
         <w:rPr>
-          <w:rFonts w:ascii="Aptos" w:hAnsi="Aptos" w:eastAsia="PingFang SC"/>
+          <w:rFonts w:ascii="Aptos" w:hAnsi="Aptos" w:eastAsia="Hiragino Sans GB"/>
           <w:b/>
           <w:color w:val="1F4E78"/>
           <w:sz w:val="32"/>
@@ -1480,7 +1463,7 @@
             </w:pPr>
             <w:r>
               <w:rPr>
-                <w:rFonts w:ascii="Aptos" w:hAnsi="Aptos" w:eastAsia="PingFang SC"/>
+                <w:rFonts w:ascii="Aptos" w:hAnsi="Aptos" w:eastAsia="Hiragino Sans GB"/>
                 <w:b/>
                 <w:color w:val="24292F"/>
                 <w:sz w:val="19"/>
@@ -1515,7 +1498,7 @@
             </w:pPr>
             <w:r>
               <w:rPr>
-                <w:rFonts w:ascii="Aptos" w:hAnsi="Aptos" w:eastAsia="PingFang SC"/>
+                <w:rFonts w:ascii="Aptos" w:hAnsi="Aptos" w:eastAsia="Hiragino Sans GB"/>
                 <w:b/>
                 <w:color w:val="24292F"/>
                 <w:sz w:val="19"/>
@@ -1550,7 +1533,7 @@
             </w:pPr>
             <w:r>
               <w:rPr>
-                <w:rFonts w:ascii="Aptos" w:hAnsi="Aptos" w:eastAsia="PingFang SC"/>
+                <w:rFonts w:ascii="Aptos" w:hAnsi="Aptos" w:eastAsia="Hiragino Sans GB"/>
                 <w:b/>
                 <w:color w:val="24292F"/>
                 <w:sz w:val="19"/>
@@ -1586,7 +1569,7 @@
             </w:pPr>
             <w:r>
               <w:rPr>
-                <w:rFonts w:ascii="Aptos" w:hAnsi="Aptos" w:eastAsia="PingFang SC"/>
+                <w:rFonts w:ascii="Aptos" w:hAnsi="Aptos" w:eastAsia="Hiragino Sans GB"/>
                 <w:b w:val="0"/>
                 <w:color w:val="24292F"/>
                 <w:sz w:val="19"/>
@@ -1620,7 +1603,7 @@
             </w:pPr>
             <w:r>
               <w:rPr>
-                <w:rFonts w:ascii="Aptos" w:hAnsi="Aptos" w:eastAsia="PingFang SC"/>
+                <w:rFonts w:ascii="Aptos" w:hAnsi="Aptos" w:eastAsia="Hiragino Sans GB"/>
                 <w:b w:val="0"/>
                 <w:color w:val="24292F"/>
                 <w:sz w:val="19"/>
@@ -1654,12 +1637,12 @@
             </w:pPr>
             <w:r>
               <w:rPr>
-                <w:rFonts w:ascii="Aptos" w:hAnsi="Aptos" w:eastAsia="PingFang SC"/>
+                <w:rFonts w:ascii="Aptos" w:hAnsi="Aptos" w:eastAsia="Hiragino Sans GB"/>
                 <w:b w:val="0"/>
                 <w:color w:val="24292F"/>
                 <w:sz w:val="19"/>
               </w:rPr>
-              <w:t>启动后手动打开大麦项目详情页</w:t>
+              <w:t>显示悬浮窗后打开项目详情页，再点悬浮“开始”</w:t>
             </w:r>
           </w:p>
         </w:tc>
@@ -1690,7 +1673,7 @@
             </w:pPr>
             <w:r>
               <w:rPr>
-                <w:rFonts w:ascii="Aptos" w:hAnsi="Aptos" w:eastAsia="PingFang SC"/>
+                <w:rFonts w:ascii="Aptos" w:hAnsi="Aptos" w:eastAsia="Hiragino Sans GB"/>
                 <w:b w:val="0"/>
                 <w:color w:val="24292F"/>
                 <w:sz w:val="19"/>
@@ -1724,12 +1707,12 @@
             </w:pPr>
             <w:r>
               <w:rPr>
-                <w:rFonts w:ascii="Aptos" w:hAnsi="Aptos" w:eastAsia="PingFang SC"/>
+                <w:rFonts w:ascii="Aptos" w:hAnsi="Aptos" w:eastAsia="Hiragino Sans GB"/>
                 <w:b w:val="0"/>
                 <w:color w:val="24292F"/>
                 <w:sz w:val="19"/>
               </w:rPr>
-              <w:t>项目已经开售，等待目标票档回流</w:t>
+              <w:t>项目已开售，等待目标票档回流</w:t>
             </w:r>
           </w:p>
         </w:tc>
@@ -1758,12 +1741,12 @@
             </w:pPr>
             <w:r>
               <w:rPr>
-                <w:rFonts w:ascii="Aptos" w:hAnsi="Aptos" w:eastAsia="PingFang SC"/>
+                <w:rFonts w:ascii="Aptos" w:hAnsi="Aptos" w:eastAsia="Hiragino Sans GB"/>
                 <w:b w:val="0"/>
                 <w:color w:val="24292F"/>
                 <w:sz w:val="19"/>
               </w:rPr>
-              <w:t>先在大麦打开场次和票档页，再切回辅助启动，之后手动切回大麦</w:t>
+              <w:t>打开目标场次和票档页，再点悬浮“开始”</w:t>
             </w:r>
           </w:p>
         </w:tc>
@@ -1794,7 +1777,7 @@
             </w:pPr>
             <w:r>
               <w:rPr>
-                <w:rFonts w:ascii="Aptos" w:hAnsi="Aptos" w:eastAsia="PingFang SC"/>
+                <w:rFonts w:ascii="Aptos" w:hAnsi="Aptos" w:eastAsia="Hiragino Sans GB"/>
                 <w:b w:val="0"/>
                 <w:color w:val="24292F"/>
                 <w:sz w:val="19"/>
@@ -1828,12 +1811,12 @@
             </w:pPr>
             <w:r>
               <w:rPr>
-                <w:rFonts w:ascii="Aptos" w:hAnsi="Aptos" w:eastAsia="PingFang SC"/>
+                <w:rFonts w:ascii="Aptos" w:hAnsi="Aptos" w:eastAsia="Hiragino Sans GB"/>
                 <w:b w:val="0"/>
                 <w:color w:val="24292F"/>
                 <w:sz w:val="19"/>
               </w:rPr>
-              <w:t>想先参加首次开售，失败后继续等待回流</w:t>
+              <w:t>先参加首次开售，失败后继续等待回流</w:t>
             </w:r>
           </w:p>
         </w:tc>
@@ -1862,12 +1845,12 @@
             </w:pPr>
             <w:r>
               <w:rPr>
-                <w:rFonts w:ascii="Aptos" w:hAnsi="Aptos" w:eastAsia="PingFang SC"/>
+                <w:rFonts w:ascii="Aptos" w:hAnsi="Aptos" w:eastAsia="Hiragino Sans GB"/>
                 <w:b w:val="0"/>
                 <w:color w:val="24292F"/>
                 <w:sz w:val="19"/>
               </w:rPr>
-              <w:t>从项目详情页开始，辅助会按安全规则切换阶段</w:t>
+              <w:t>从项目详情页开始，辅助按安全规则切换阶段</w:t>
             </w:r>
           </w:p>
         </w:tc>
@@ -1884,28 +1867,11 @@
       </w:pPr>
       <w:r>
         <w:rPr>
-          <w:rFonts w:ascii="Aptos" w:hAnsi="Aptos" w:eastAsia="PingFang SC"/>
+          <w:rFonts w:ascii="Aptos" w:hAnsi="Aptos" w:eastAsia="Hiragino Sans GB"/>
           <w:color w:val="24292F"/>
           <w:sz w:val="21"/>
         </w:rPr>
-        <w:t xml:space="preserve">第一次使用建议先选“只抢票”，并把最大提交次数设为 </w:t>
-      </w:r>
-      <w:r>
-        <w:rPr>
-          <w:rFonts w:ascii="Aptos" w:hAnsi="Aptos" w:eastAsia="Menlo"/>
-          <w:color w:val="9C2B2E"/>
-          <w:sz w:val="21"/>
-          <w:highlight/>
-        </w:rPr>
-        <w:t>1</w:t>
-      </w:r>
-      <w:r>
-        <w:rPr>
-          <w:rFonts w:ascii="Aptos" w:hAnsi="Aptos" w:eastAsia="PingFang SC"/>
-          <w:color w:val="24292F"/>
-          <w:sz w:val="21"/>
-        </w:rPr>
-        <w:t>。</w:t>
+        <w:t>第一次使用建议先选“只抢票”，并确保你能随时使用悬浮按钮停止任务。</w:t>
       </w:r>
     </w:p>
     <w:p>
@@ -1915,7 +1881,7 @@
       </w:pPr>
       <w:r>
         <w:rPr>
-          <w:rFonts w:ascii="Aptos" w:hAnsi="Aptos" w:eastAsia="PingFang SC"/>
+          <w:rFonts w:ascii="Aptos" w:hAnsi="Aptos" w:eastAsia="Hiragino Sans GB"/>
           <w:b/>
           <w:color w:val="1F4E78"/>
           <w:sz w:val="32"/>
@@ -1930,7 +1896,7 @@
       </w:pPr>
       <w:r>
         <w:rPr>
-          <w:rFonts w:ascii="Aptos" w:hAnsi="Aptos" w:eastAsia="PingFang SC"/>
+          <w:rFonts w:ascii="Aptos" w:hAnsi="Aptos" w:eastAsia="Hiragino Sans GB"/>
           <w:b/>
           <w:color w:val="1F4E78"/>
           <w:sz w:val="21"/>
@@ -1939,11 +1905,11 @@
       </w:r>
       <w:r>
         <w:rPr>
-          <w:rFonts w:ascii="Aptos" w:hAnsi="Aptos" w:eastAsia="PingFang SC"/>
+          <w:rFonts w:ascii="Aptos" w:hAnsi="Aptos" w:eastAsia="Hiragino Sans GB"/>
           <w:color w:val="24292F"/>
           <w:sz w:val="21"/>
         </w:rPr>
-        <w:t>再检查一次场次、票档、价格和数量。</w:t>
+        <w:t>再检查一次演出日期和票档价格。</w:t>
       </w:r>
     </w:p>
     <w:p>
@@ -1953,7 +1919,7 @@
       </w:pPr>
       <w:r>
         <w:rPr>
-          <w:rFonts w:ascii="Aptos" w:hAnsi="Aptos" w:eastAsia="PingFang SC"/>
+          <w:rFonts w:ascii="Aptos" w:hAnsi="Aptos" w:eastAsia="Hiragino Sans GB"/>
           <w:b/>
           <w:color w:val="1F4E78"/>
           <w:sz w:val="21"/>
@@ -1962,11 +1928,11 @@
       </w:r>
       <w:r>
         <w:rPr>
-          <w:rFonts w:ascii="Aptos" w:hAnsi="Aptos" w:eastAsia="PingFang SC"/>
+          <w:rFonts w:ascii="Aptos" w:hAnsi="Aptos" w:eastAsia="Hiragino Sans GB"/>
           <w:color w:val="24292F"/>
           <w:sz w:val="21"/>
         </w:rPr>
-        <w:t>点击“保存并开始”。</w:t>
+        <w:t>点击“保存配置并显示悬浮窗”。</w:t>
       </w:r>
     </w:p>
     <w:p>
@@ -1976,7 +1942,7 @@
       </w:pPr>
       <w:r>
         <w:rPr>
-          <w:rFonts w:ascii="Aptos" w:hAnsi="Aptos" w:eastAsia="PingFang SC"/>
+          <w:rFonts w:ascii="Aptos" w:hAnsi="Aptos" w:eastAsia="Hiragino Sans GB"/>
           <w:b/>
           <w:color w:val="1F4E78"/>
           <w:sz w:val="21"/>
@@ -1985,7 +1951,7 @@
       </w:r>
       <w:r>
         <w:rPr>
-          <w:rFonts w:ascii="Aptos" w:hAnsi="Aptos" w:eastAsia="PingFang SC"/>
+          <w:rFonts w:ascii="Aptos" w:hAnsi="Aptos" w:eastAsia="Hiragino Sans GB"/>
           <w:color w:val="24292F"/>
           <w:sz w:val="21"/>
         </w:rPr>
@@ -1999,7 +1965,7 @@
       </w:pPr>
       <w:r>
         <w:rPr>
-          <w:rFonts w:ascii="Aptos" w:hAnsi="Aptos" w:eastAsia="PingFang SC"/>
+          <w:rFonts w:ascii="Aptos" w:hAnsi="Aptos" w:eastAsia="Hiragino Sans GB"/>
           <w:b/>
           <w:color w:val="1F4E78"/>
           <w:sz w:val="21"/>
@@ -2008,11 +1974,11 @@
       </w:r>
       <w:r>
         <w:rPr>
-          <w:rFonts w:ascii="Aptos" w:hAnsi="Aptos" w:eastAsia="PingFang SC"/>
+          <w:rFonts w:ascii="Aptos" w:hAnsi="Aptos" w:eastAsia="Hiragino Sans GB"/>
           <w:color w:val="24292F"/>
           <w:sz w:val="21"/>
         </w:rPr>
-        <w:t>你需要自己打开或切换到大麦。</w:t>
+        <w:t>手动打开或切换到目标大麦页面。</w:t>
       </w:r>
     </w:p>
     <w:p>
@@ -2022,7 +1988,7 @@
       </w:pPr>
       <w:r>
         <w:rPr>
-          <w:rFonts w:ascii="Aptos" w:hAnsi="Aptos" w:eastAsia="PingFang SC"/>
+          <w:rFonts w:ascii="Aptos" w:hAnsi="Aptos" w:eastAsia="Hiragino Sans GB"/>
           <w:b/>
           <w:color w:val="1F4E78"/>
           <w:sz w:val="21"/>
@@ -2031,11 +1997,11 @@
       </w:r>
       <w:r>
         <w:rPr>
-          <w:rFonts w:ascii="Aptos" w:hAnsi="Aptos" w:eastAsia="PingFang SC"/>
+          <w:rFonts w:ascii="Aptos" w:hAnsi="Aptos" w:eastAsia="Hiragino Sans GB"/>
           <w:color w:val="24292F"/>
           <w:sz w:val="21"/>
         </w:rPr>
-        <w:t>左上角会显示运行状态、简短日志和“停止”按钮。</w:t>
+        <w:t>点击左上角悬浮控件中的“开始”。</w:t>
       </w:r>
     </w:p>
     <w:p>
@@ -2044,11 +2010,11 @@
       </w:pPr>
       <w:r>
         <w:rPr>
-          <w:rFonts w:ascii="Aptos" w:hAnsi="Aptos" w:eastAsia="PingFang SC"/>
+          <w:rFonts w:ascii="Aptos" w:hAnsi="Aptos" w:eastAsia="Hiragino Sans GB"/>
           <w:color w:val="24292F"/>
           <w:sz w:val="21"/>
         </w:rPr>
-        <w:t>应用不会自己打开大麦。如果点击开始后停留在手机桌面，请手动打开大麦。</w:t>
+        <w:t>从点击悬浮“开始”起才识别页面；应用不会自动打开大麦。</w:t>
       </w:r>
     </w:p>
     <w:p>
@@ -2058,7 +2024,7 @@
       </w:pPr>
       <w:r>
         <w:rPr>
-          <w:rFonts w:ascii="Aptos" w:hAnsi="Aptos" w:eastAsia="PingFang SC"/>
+          <w:rFonts w:ascii="Aptos" w:hAnsi="Aptos" w:eastAsia="Hiragino Sans GB"/>
           <w:b/>
           <w:color w:val="1F4E78"/>
           <w:sz w:val="32"/>
@@ -2073,7 +2039,7 @@
       </w:pPr>
       <w:r>
         <w:rPr>
-          <w:rFonts w:ascii="Aptos" w:hAnsi="Aptos" w:eastAsia="PingFang SC"/>
+          <w:rFonts w:ascii="Aptos" w:hAnsi="Aptos" w:eastAsia="Hiragino Sans GB"/>
           <w:b w:val="0"/>
           <w:color w:val="24292F"/>
           <w:sz w:val="21"/>
@@ -2082,20 +2048,20 @@
       </w:r>
       <w:r>
         <w:rPr>
-          <w:rFonts w:ascii="Aptos" w:hAnsi="Aptos" w:eastAsia="PingFang SC"/>
+          <w:rFonts w:ascii="Aptos" w:hAnsi="Aptos" w:eastAsia="Hiragino Sans GB"/>
           <w:b/>
           <w:color w:val="24292F"/>
           <w:sz w:val="21"/>
         </w:rPr>
-        <w:t>等待</w:t>
+        <w:t>开始</w:t>
       </w:r>
       <w:r>
         <w:rPr>
-          <w:rFonts w:ascii="Aptos" w:hAnsi="Aptos" w:eastAsia="PingFang SC"/>
+          <w:rFonts w:ascii="Aptos" w:hAnsi="Aptos" w:eastAsia="Hiragino Sans GB"/>
           <w:color w:val="24292F"/>
           <w:sz w:val="21"/>
         </w:rPr>
-        <w:t>：还没有识别到符合条件的大麦页面，不会盲目点击。</w:t>
+        <w:t>：配置已经保存，尚未开始识别。</w:t>
       </w:r>
     </w:p>
     <w:p>
@@ -2105,7 +2071,7 @@
       </w:pPr>
       <w:r>
         <w:rPr>
-          <w:rFonts w:ascii="Aptos" w:hAnsi="Aptos" w:eastAsia="PingFang SC"/>
+          <w:rFonts w:ascii="Aptos" w:hAnsi="Aptos" w:eastAsia="Hiragino Sans GB"/>
           <w:b w:val="0"/>
           <w:color w:val="24292F"/>
           <w:sz w:val="21"/>
@@ -2114,20 +2080,20 @@
       </w:r>
       <w:r>
         <w:rPr>
-          <w:rFonts w:ascii="Aptos" w:hAnsi="Aptos" w:eastAsia="PingFang SC"/>
+          <w:rFonts w:ascii="Aptos" w:hAnsi="Aptos" w:eastAsia="Hiragino Sans GB"/>
           <w:b/>
           <w:color w:val="24292F"/>
           <w:sz w:val="21"/>
         </w:rPr>
-        <w:t>暂停</w:t>
+        <w:t>识别中</w:t>
       </w:r>
       <w:r>
         <w:rPr>
-          <w:rFonts w:ascii="Aptos" w:hAnsi="Aptos" w:eastAsia="PingFang SC"/>
+          <w:rFonts w:ascii="Aptos" w:hAnsi="Aptos" w:eastAsia="Hiragino Sans GB"/>
           <w:color w:val="24292F"/>
           <w:sz w:val="21"/>
         </w:rPr>
-        <w:t>：当前页面已经识别，可以临时暂停；恢复后会重新检查页面。</w:t>
+        <w:t>：已点击悬浮“开始”，应用正在读取当前大麦页面。</w:t>
       </w:r>
     </w:p>
     <w:p>
@@ -2137,7 +2103,7 @@
       </w:pPr>
       <w:r>
         <w:rPr>
-          <w:rFonts w:ascii="Aptos" w:hAnsi="Aptos" w:eastAsia="PingFang SC"/>
+          <w:rFonts w:ascii="Aptos" w:hAnsi="Aptos" w:eastAsia="Hiragino Sans GB"/>
           <w:b w:val="0"/>
           <w:color w:val="24292F"/>
           <w:sz w:val="21"/>
@@ -2146,7 +2112,70 @@
       </w:r>
       <w:r>
         <w:rPr>
-          <w:rFonts w:ascii="Aptos" w:hAnsi="Aptos" w:eastAsia="PingFang SC"/>
+          <w:rFonts w:ascii="Aptos" w:hAnsi="Aptos" w:eastAsia="Hiragino Sans GB"/>
+          <w:b/>
+          <w:color w:val="24292F"/>
+          <w:sz w:val="21"/>
+        </w:rPr>
+        <w:t>运行中</w:t>
+      </w:r>
+      <w:r>
+        <w:rPr>
+          <w:rFonts w:ascii="Aptos" w:hAnsi="Aptos" w:eastAsia="Hiragino Sans GB"/>
+          <w:color w:val="24292F"/>
+          <w:sz w:val="21"/>
+        </w:rPr>
+        <w:t>：已经识别目标起始页；等待按钮可用或页面变化时会继续轮询。</w:t>
+      </w:r>
+    </w:p>
+    <w:p>
+      <w:pPr>
+        <w:spacing w:after="80" w:line="300" w:lineRule="auto"/>
+        <w:ind w:left="403" w:hanging="288"/>
+      </w:pPr>
+      <w:r>
+        <w:rPr>
+          <w:rFonts w:ascii="Aptos" w:hAnsi="Aptos" w:eastAsia="Hiragino Sans GB"/>
+          <w:b w:val="0"/>
+          <w:color w:val="24292F"/>
+          <w:sz w:val="21"/>
+        </w:rPr>
+        <w:t xml:space="preserve">• </w:t>
+      </w:r>
+      <w:r>
+        <w:rPr>
+          <w:rFonts w:ascii="Aptos" w:hAnsi="Aptos" w:eastAsia="Hiragino Sans GB"/>
+          <w:b/>
+          <w:color w:val="24292F"/>
+          <w:sz w:val="21"/>
+        </w:rPr>
+        <w:t>暂停</w:t>
+      </w:r>
+      <w:r>
+        <w:rPr>
+          <w:rFonts w:ascii="Aptos" w:hAnsi="Aptos" w:eastAsia="Hiragino Sans GB"/>
+          <w:color w:val="24292F"/>
+          <w:sz w:val="21"/>
+        </w:rPr>
+        <w:t>：当前页面已经识别，可以临时暂停；恢复后会重新检查页面。</w:t>
+      </w:r>
+    </w:p>
+    <w:p>
+      <w:pPr>
+        <w:spacing w:after="140" w:line="324" w:lineRule="auto"/>
+      </w:pPr>
+      <w:r>
+        <w:rPr>
+          <w:rFonts w:ascii="Aptos" w:hAnsi="Aptos" w:eastAsia="Hiragino Sans GB"/>
+          <w:b w:val="0"/>
+          <w:color w:val="24292F"/>
+          <w:sz w:val="21"/>
+        </w:rPr>
+        <w:t xml:space="preserve">• </w:t>
+      </w:r>
+      <w:r>
+        <w:rPr>
+          <w:rFonts w:ascii="Aptos" w:hAnsi="Aptos" w:eastAsia="Hiragino Sans GB"/>
           <w:b/>
           <w:color w:val="24292F"/>
           <w:sz w:val="21"/>
@@ -2155,7 +2184,7 @@
       </w:r>
       <w:r>
         <w:rPr>
-          <w:rFonts w:ascii="Aptos" w:hAnsi="Aptos" w:eastAsia="PingFang SC"/>
+          <w:rFonts w:ascii="Aptos" w:hAnsi="Aptos" w:eastAsia="Hiragino Sans GB"/>
           <w:color w:val="24292F"/>
           <w:sz w:val="21"/>
         </w:rPr>
@@ -2169,7 +2198,7 @@
       </w:pPr>
       <w:r>
         <w:rPr>
-          <w:rFonts w:ascii="Aptos" w:hAnsi="Aptos" w:eastAsia="PingFang SC"/>
+          <w:rFonts w:ascii="Aptos" w:hAnsi="Aptos" w:eastAsia="Hiragino Sans GB"/>
           <w:b w:val="0"/>
           <w:color w:val="24292F"/>
           <w:sz w:val="21"/>
@@ -2178,65 +2207,20 @@
       </w:r>
       <w:r>
         <w:rPr>
-          <w:rFonts w:ascii="Aptos" w:hAnsi="Aptos" w:eastAsia="PingFang SC"/>
+          <w:rFonts w:ascii="Aptos" w:hAnsi="Aptos" w:eastAsia="Hiragino Sans GB"/>
           <w:b/>
           <w:color w:val="24292F"/>
           <w:sz w:val="21"/>
         </w:rPr>
-        <w:t>安全暂停</w:t>
+        <w:t>安全暂停 / 订单锁定</w:t>
       </w:r>
       <w:r>
         <w:rPr>
-          <w:rFonts w:ascii="Aptos" w:hAnsi="Aptos" w:eastAsia="PingFang SC"/>
+          <w:rFonts w:ascii="Aptos" w:hAnsi="Aptos" w:eastAsia="Hiragino Sans GB"/>
           <w:color w:val="24292F"/>
           <w:sz w:val="21"/>
         </w:rPr>
-        <w:t>：页面、项目、场次、票档、价格或数量不一致，或者出现未知页面，</w:t>
-      </w:r>
-    </w:p>
-    <w:p>
-      <w:pPr>
-        <w:spacing w:after="140" w:line="324" w:lineRule="auto"/>
-      </w:pPr>
-      <w:r>
-        <w:rPr>
-          <w:rFonts w:ascii="Aptos" w:hAnsi="Aptos" w:eastAsia="PingFang SC"/>
-          <w:color w:val="24292F"/>
-          <w:sz w:val="21"/>
-        </w:rPr>
-        <w:t>辅助不会继续点击。</w:t>
-      </w:r>
-    </w:p>
-    <w:p>
-      <w:pPr>
-        <w:spacing w:after="80" w:line="300" w:lineRule="auto"/>
-        <w:ind w:left="403" w:hanging="288"/>
-      </w:pPr>
-      <w:r>
-        <w:rPr>
-          <w:rFonts w:ascii="Aptos" w:hAnsi="Aptos" w:eastAsia="PingFang SC"/>
-          <w:b w:val="0"/>
-          <w:color w:val="24292F"/>
-          <w:sz w:val="21"/>
-        </w:rPr>
-        <w:t xml:space="preserve">• </w:t>
-      </w:r>
-      <w:r>
-        <w:rPr>
-          <w:rFonts w:ascii="Aptos" w:hAnsi="Aptos" w:eastAsia="PingFang SC"/>
-          <w:b/>
-          <w:color w:val="24292F"/>
-          <w:sz w:val="21"/>
-        </w:rPr>
-        <w:t>订单锁定</w:t>
-      </w:r>
-      <w:r>
-        <w:rPr>
-          <w:rFonts w:ascii="Aptos" w:hAnsi="Aptos" w:eastAsia="PingFang SC"/>
-          <w:color w:val="24292F"/>
-          <w:sz w:val="21"/>
-        </w:rPr>
-        <w:t>：已经进入收银台，自动操作结束，需要你自己确认是否付款。</w:t>
+        <w:t>：页面不一致或未知时会安全暂停；进入收银台后自动操作结束。</w:t>
       </w:r>
     </w:p>
     <w:p>
@@ -2246,7 +2230,7 @@
       </w:pPr>
       <w:r>
         <w:rPr>
-          <w:rFonts w:ascii="Aptos" w:hAnsi="Aptos" w:eastAsia="PingFang SC"/>
+          <w:rFonts w:ascii="Aptos" w:hAnsi="Aptos" w:eastAsia="Hiragino Sans GB"/>
           <w:b/>
           <w:color w:val="1F4E78"/>
           <w:sz w:val="32"/>
@@ -2261,7 +2245,7 @@
       </w:pPr>
       <w:r>
         <w:rPr>
-          <w:rFonts w:ascii="Aptos" w:hAnsi="Aptos" w:eastAsia="PingFang SC"/>
+          <w:rFonts w:ascii="Aptos" w:hAnsi="Aptos" w:eastAsia="Hiragino Sans GB"/>
           <w:b w:val="0"/>
           <w:color w:val="24292F"/>
           <w:sz w:val="21"/>
@@ -2270,7 +2254,14 @@
       </w:r>
       <w:r>
         <w:rPr>
-          <w:rFonts w:ascii="Aptos" w:hAnsi="Aptos" w:eastAsia="PingFang SC"/>
+          <w:rFonts w:ascii="Aptos" w:hAnsi="Aptos" w:eastAsia="Hiragino Sans GB"/>
+          <w:color w:val="24292F"/>
+          <w:sz w:val="21"/>
+        </w:rPr>
+      </w:r>
+      <w:r>
+        <w:rPr>
+          <w:rFonts w:ascii="Aptos" w:hAnsi="Aptos" w:eastAsia="Hiragino Sans GB"/>
           <w:color w:val="24292F"/>
           <w:sz w:val="21"/>
         </w:rPr>
@@ -2284,7 +2275,7 @@
       </w:pPr>
       <w:r>
         <w:rPr>
-          <w:rFonts w:ascii="Aptos" w:hAnsi="Aptos" w:eastAsia="PingFang SC"/>
+          <w:rFonts w:ascii="Aptos" w:hAnsi="Aptos" w:eastAsia="Hiragino Sans GB"/>
           <w:b w:val="0"/>
           <w:color w:val="24292F"/>
           <w:sz w:val="21"/>
@@ -2293,7 +2284,14 @@
       </w:r>
       <w:r>
         <w:rPr>
-          <w:rFonts w:ascii="Aptos" w:hAnsi="Aptos" w:eastAsia="PingFang SC"/>
+          <w:rFonts w:ascii="Aptos" w:hAnsi="Aptos" w:eastAsia="Hiragino Sans GB"/>
+          <w:color w:val="24292F"/>
+          <w:sz w:val="21"/>
+        </w:rPr>
+      </w:r>
+      <w:r>
+        <w:rPr>
+          <w:rFonts w:ascii="Aptos" w:hAnsi="Aptos" w:eastAsia="Hiragino Sans GB"/>
           <w:color w:val="24292F"/>
           <w:sz w:val="21"/>
         </w:rPr>
@@ -2307,7 +2305,7 @@
       </w:pPr>
       <w:r>
         <w:rPr>
-          <w:rFonts w:ascii="Aptos" w:hAnsi="Aptos" w:eastAsia="PingFang SC"/>
+          <w:rFonts w:ascii="Aptos" w:hAnsi="Aptos" w:eastAsia="Hiragino Sans GB"/>
           <w:b w:val="0"/>
           <w:color w:val="24292F"/>
           <w:sz w:val="21"/>
@@ -2316,11 +2314,18 @@
       </w:r>
       <w:r>
         <w:rPr>
-          <w:rFonts w:ascii="Aptos" w:hAnsi="Aptos" w:eastAsia="PingFang SC"/>
+          <w:rFonts w:ascii="Aptos" w:hAnsi="Aptos" w:eastAsia="Hiragino Sans GB"/>
           <w:color w:val="24292F"/>
           <w:sz w:val="21"/>
         </w:rPr>
-        <w:t>场次、票档、价格、数量全部一致后才继续。</w:t>
+      </w:r>
+      <w:r>
+        <w:rPr>
+          <w:rFonts w:ascii="Aptos" w:hAnsi="Aptos" w:eastAsia="Hiragino Sans GB"/>
+          <w:color w:val="24292F"/>
+          <w:sz w:val="21"/>
+        </w:rPr>
+        <w:t>演出日期和票档价格一致后才继续。</w:t>
       </w:r>
     </w:p>
     <w:p>
@@ -2330,7 +2335,7 @@
       </w:pPr>
       <w:r>
         <w:rPr>
-          <w:rFonts w:ascii="Aptos" w:hAnsi="Aptos" w:eastAsia="PingFang SC"/>
+          <w:rFonts w:ascii="Aptos" w:hAnsi="Aptos" w:eastAsia="Hiragino Sans GB"/>
           <w:b w:val="0"/>
           <w:color w:val="24292F"/>
           <w:sz w:val="21"/>
@@ -2339,7 +2344,14 @@
       </w:r>
       <w:r>
         <w:rPr>
-          <w:rFonts w:ascii="Aptos" w:hAnsi="Aptos" w:eastAsia="PingFang SC"/>
+          <w:rFonts w:ascii="Aptos" w:hAnsi="Aptos" w:eastAsia="Hiragino Sans GB"/>
+          <w:color w:val="24292F"/>
+          <w:sz w:val="21"/>
+        </w:rPr>
+      </w:r>
+      <w:r>
+        <w:rPr>
+          <w:rFonts w:ascii="Aptos" w:hAnsi="Aptos" w:eastAsia="Hiragino Sans GB"/>
           <w:color w:val="24292F"/>
           <w:sz w:val="21"/>
         </w:rPr>
@@ -2353,7 +2365,7 @@
       </w:pPr>
       <w:r>
         <w:rPr>
-          <w:rFonts w:ascii="Aptos" w:hAnsi="Aptos" w:eastAsia="PingFang SC"/>
+          <w:rFonts w:ascii="Aptos" w:hAnsi="Aptos" w:eastAsia="Hiragino Sans GB"/>
           <w:b w:val="0"/>
           <w:color w:val="24292F"/>
           <w:sz w:val="21"/>
@@ -2362,7 +2374,14 @@
       </w:r>
       <w:r>
         <w:rPr>
-          <w:rFonts w:ascii="Aptos" w:hAnsi="Aptos" w:eastAsia="PingFang SC"/>
+          <w:rFonts w:ascii="Aptos" w:hAnsi="Aptos" w:eastAsia="Hiragino Sans GB"/>
+          <w:color w:val="24292F"/>
+          <w:sz w:val="21"/>
+        </w:rPr>
+      </w:r>
+      <w:r>
+        <w:rPr>
+          <w:rFonts w:ascii="Aptos" w:hAnsi="Aptos" w:eastAsia="Hiragino Sans GB"/>
           <w:color w:val="24292F"/>
           <w:sz w:val="21"/>
         </w:rPr>
@@ -2376,7 +2395,7 @@
       </w:pPr>
       <w:r>
         <w:rPr>
-          <w:rFonts w:ascii="Aptos" w:hAnsi="Aptos" w:eastAsia="PingFang SC"/>
+          <w:rFonts w:ascii="Aptos" w:hAnsi="Aptos" w:eastAsia="Hiragino Sans GB"/>
           <w:b w:val="0"/>
           <w:color w:val="24292F"/>
           <w:sz w:val="21"/>
@@ -2385,7 +2404,14 @@
       </w:r>
       <w:r>
         <w:rPr>
-          <w:rFonts w:ascii="Aptos" w:hAnsi="Aptos" w:eastAsia="PingFang SC"/>
+          <w:rFonts w:ascii="Aptos" w:hAnsi="Aptos" w:eastAsia="Hiragino Sans GB"/>
+          <w:color w:val="24292F"/>
+          <w:sz w:val="21"/>
+        </w:rPr>
+      </w:r>
+      <w:r>
+        <w:rPr>
+          <w:rFonts w:ascii="Aptos" w:hAnsi="Aptos" w:eastAsia="Hiragino Sans GB"/>
           <w:color w:val="24292F"/>
           <w:sz w:val="21"/>
         </w:rPr>
@@ -2398,11 +2424,11 @@
       </w:pPr>
       <w:r>
         <w:rPr>
-          <w:rFonts w:ascii="Aptos" w:hAnsi="Aptos" w:eastAsia="PingFang SC"/>
+          <w:rFonts w:ascii="Aptos" w:hAnsi="Aptos" w:eastAsia="Hiragino Sans GB"/>
           <w:color w:val="24292F"/>
           <w:sz w:val="21"/>
         </w:rPr>
-        <w:t>实际能否买到票仍取决于平台页面、网络、库存和平台规则。辅助不会绕过平台限制， 也不能保证购票成功。</w:t>
+        <w:t>页面没有变化时，相同等待原因 15 秒内最多记录一次；原因变化也至少间隔 2 秒。连续约 3 秒没有读取到大麦页面时会提示“未读取到大麦页面，请确认大麦在前台”，并继续每 300 毫秒探测。</w:t>
       </w:r>
     </w:p>
     <w:p>
@@ -2412,7 +2438,7 @@
       </w:pPr>
       <w:r>
         <w:rPr>
-          <w:rFonts w:ascii="Aptos" w:hAnsi="Aptos" w:eastAsia="PingFang SC"/>
+          <w:rFonts w:ascii="Aptos" w:hAnsi="Aptos" w:eastAsia="Hiragino Sans GB"/>
           <w:b/>
           <w:color w:val="1F4E78"/>
           <w:sz w:val="32"/>
@@ -2426,7 +2452,7 @@
       </w:pPr>
       <w:r>
         <w:rPr>
-          <w:rFonts w:ascii="Aptos" w:hAnsi="Aptos" w:eastAsia="PingFang SC"/>
+          <w:rFonts w:ascii="Aptos" w:hAnsi="Aptos" w:eastAsia="Hiragino Sans GB"/>
           <w:color w:val="24292F"/>
           <w:sz w:val="21"/>
         </w:rPr>
@@ -2440,7 +2466,7 @@
       </w:pPr>
       <w:r>
         <w:rPr>
-          <w:rFonts w:ascii="Aptos" w:hAnsi="Aptos" w:eastAsia="PingFang SC"/>
+          <w:rFonts w:ascii="Aptos" w:hAnsi="Aptos" w:eastAsia="Hiragino Sans GB"/>
           <w:b/>
           <w:color w:val="1F4E78"/>
           <w:sz w:val="21"/>
@@ -2449,7 +2475,7 @@
       </w:r>
       <w:r>
         <w:rPr>
-          <w:rFonts w:ascii="Aptos" w:hAnsi="Aptos" w:eastAsia="PingFang SC"/>
+          <w:rFonts w:ascii="Aptos" w:hAnsi="Aptos" w:eastAsia="Hiragino Sans GB"/>
           <w:color w:val="24292F"/>
           <w:sz w:val="21"/>
         </w:rPr>
@@ -2463,7 +2489,7 @@
       </w:pPr>
       <w:r>
         <w:rPr>
-          <w:rFonts w:ascii="Aptos" w:hAnsi="Aptos" w:eastAsia="PingFang SC"/>
+          <w:rFonts w:ascii="Aptos" w:hAnsi="Aptos" w:eastAsia="Hiragino Sans GB"/>
           <w:b/>
           <w:color w:val="1F4E78"/>
           <w:sz w:val="21"/>
@@ -2472,7 +2498,7 @@
       </w:r>
       <w:r>
         <w:rPr>
-          <w:rFonts w:ascii="Aptos" w:hAnsi="Aptos" w:eastAsia="PingFang SC"/>
+          <w:rFonts w:ascii="Aptos" w:hAnsi="Aptos" w:eastAsia="Hiragino Sans GB"/>
           <w:color w:val="24292F"/>
           <w:sz w:val="21"/>
         </w:rPr>
@@ -2485,7 +2511,7 @@
       </w:pPr>
       <w:r>
         <w:rPr>
-          <w:rFonts w:ascii="Aptos" w:hAnsi="Aptos" w:eastAsia="PingFang SC"/>
+          <w:rFonts w:ascii="Aptos" w:hAnsi="Aptos" w:eastAsia="Hiragino Sans GB"/>
           <w:color w:val="24292F"/>
           <w:sz w:val="21"/>
         </w:rPr>
@@ -2499,7 +2525,7 @@
       </w:pPr>
       <w:r>
         <w:rPr>
-          <w:rFonts w:ascii="Aptos" w:hAnsi="Aptos" w:eastAsia="PingFang SC"/>
+          <w:rFonts w:ascii="Aptos" w:hAnsi="Aptos" w:eastAsia="Hiragino Sans GB"/>
           <w:b/>
           <w:color w:val="1F4E78"/>
           <w:sz w:val="32"/>
@@ -2514,12 +2540,12 @@
       </w:pPr>
       <w:r>
         <w:rPr>
-          <w:rFonts w:ascii="Aptos" w:hAnsi="Aptos" w:eastAsia="PingFang SC"/>
+          <w:rFonts w:ascii="Aptos" w:hAnsi="Aptos" w:eastAsia="Hiragino Sans GB"/>
           <w:b/>
           <w:color w:val="1F4E78"/>
           <w:sz w:val="26"/>
         </w:rPr>
-        <w:t>“保存并开始”不能点击</w:t>
+        <w:t>“保存配置并显示悬浮窗”不能点击</w:t>
       </w:r>
     </w:p>
     <w:p>
@@ -2528,7 +2554,7 @@
       </w:pPr>
       <w:r>
         <w:rPr>
-          <w:rFonts w:ascii="Aptos" w:hAnsi="Aptos" w:eastAsia="PingFang SC"/>
+          <w:rFonts w:ascii="Aptos" w:hAnsi="Aptos" w:eastAsia="Hiragino Sans GB"/>
           <w:color w:val="24292F"/>
           <w:sz w:val="21"/>
         </w:rPr>
@@ -2542,7 +2568,7 @@
       </w:pPr>
       <w:r>
         <w:rPr>
-          <w:rFonts w:ascii="Aptos" w:hAnsi="Aptos" w:eastAsia="PingFang SC"/>
+          <w:rFonts w:ascii="Aptos" w:hAnsi="Aptos" w:eastAsia="Hiragino Sans GB"/>
           <w:b w:val="0"/>
           <w:color w:val="24292F"/>
           <w:sz w:val="21"/>
@@ -2551,11 +2577,18 @@
       </w:r>
       <w:r>
         <w:rPr>
-          <w:rFonts w:ascii="Aptos" w:hAnsi="Aptos" w:eastAsia="PingFang SC"/>
+          <w:rFonts w:ascii="Aptos" w:hAnsi="Aptos" w:eastAsia="Hiragino Sans GB"/>
           <w:color w:val="24292F"/>
           <w:sz w:val="21"/>
         </w:rPr>
-        <w:t>无障碍服务是否显示“已开启”。</w:t>
+      </w:r>
+      <w:r>
+        <w:rPr>
+          <w:rFonts w:ascii="Aptos" w:hAnsi="Aptos" w:eastAsia="Hiragino Sans GB"/>
+          <w:color w:val="24292F"/>
+          <w:sz w:val="21"/>
+        </w:rPr>
+        <w:t>是否显示“无障碍服务 · 已开启”。</w:t>
       </w:r>
     </w:p>
     <w:p>
@@ -2565,7 +2598,7 @@
       </w:pPr>
       <w:r>
         <w:rPr>
-          <w:rFonts w:ascii="Aptos" w:hAnsi="Aptos" w:eastAsia="PingFang SC"/>
+          <w:rFonts w:ascii="Aptos" w:hAnsi="Aptos" w:eastAsia="Hiragino Sans GB"/>
           <w:b w:val="0"/>
           <w:color w:val="24292F"/>
           <w:sz w:val="21"/>
@@ -2574,11 +2607,18 @@
       </w:r>
       <w:r>
         <w:rPr>
-          <w:rFonts w:ascii="Aptos" w:hAnsi="Aptos" w:eastAsia="PingFang SC"/>
+          <w:rFonts w:ascii="Aptos" w:hAnsi="Aptos" w:eastAsia="Hiragino Sans GB"/>
           <w:color w:val="24292F"/>
           <w:sz w:val="21"/>
         </w:rPr>
-        <w:t>运行通知是否显示“已允许”。</w:t>
+      </w:r>
+      <w:r>
+        <w:rPr>
+          <w:rFonts w:ascii="Aptos" w:hAnsi="Aptos" w:eastAsia="Hiragino Sans GB"/>
+          <w:color w:val="24292F"/>
+          <w:sz w:val="21"/>
+        </w:rPr>
+        <w:t>是否显示“运行通知 · 已开启”。</w:t>
       </w:r>
     </w:p>
     <w:p>
@@ -2588,7 +2628,7 @@
       </w:pPr>
       <w:r>
         <w:rPr>
-          <w:rFonts w:ascii="Aptos" w:hAnsi="Aptos" w:eastAsia="PingFang SC"/>
+          <w:rFonts w:ascii="Aptos" w:hAnsi="Aptos" w:eastAsia="Hiragino Sans GB"/>
           <w:b w:val="0"/>
           <w:color w:val="24292F"/>
           <w:sz w:val="21"/>
@@ -2597,11 +2637,18 @@
       </w:r>
       <w:r>
         <w:rPr>
-          <w:rFonts w:ascii="Aptos" w:hAnsi="Aptos" w:eastAsia="PingFang SC"/>
+          <w:rFonts w:ascii="Aptos" w:hAnsi="Aptos" w:eastAsia="Hiragino Sans GB"/>
           <w:color w:val="24292F"/>
           <w:sz w:val="21"/>
         </w:rPr>
-        <w:t>所有目标字段是否都已填写。</w:t>
+      </w:r>
+      <w:r>
+        <w:rPr>
+          <w:rFonts w:ascii="Aptos" w:hAnsi="Aptos" w:eastAsia="Hiragino Sans GB"/>
+          <w:color w:val="24292F"/>
+          <w:sz w:val="21"/>
+        </w:rPr>
+        <w:t>是否已经选择演出日期并填写票档价格。</w:t>
       </w:r>
     </w:p>
     <w:p>
@@ -2611,7 +2658,7 @@
       </w:pPr>
       <w:r>
         <w:rPr>
-          <w:rFonts w:ascii="Aptos" w:hAnsi="Aptos" w:eastAsia="PingFang SC"/>
+          <w:rFonts w:ascii="Aptos" w:hAnsi="Aptos" w:eastAsia="Hiragino Sans GB"/>
           <w:b w:val="0"/>
           <w:color w:val="24292F"/>
           <w:sz w:val="21"/>
@@ -2620,11 +2667,18 @@
       </w:r>
       <w:r>
         <w:rPr>
-          <w:rFonts w:ascii="Aptos" w:hAnsi="Aptos" w:eastAsia="PingFang SC"/>
+          <w:rFonts w:ascii="Aptos" w:hAnsi="Aptos" w:eastAsia="Hiragino Sans GB"/>
           <w:color w:val="24292F"/>
           <w:sz w:val="21"/>
         </w:rPr>
-        <w:t>是否勾选了大麦配置确认。</w:t>
+      </w:r>
+      <w:r>
+        <w:rPr>
+          <w:rFonts w:ascii="Aptos" w:hAnsi="Aptos" w:eastAsia="Hiragino Sans GB"/>
+          <w:color w:val="24292F"/>
+          <w:sz w:val="21"/>
+        </w:rPr>
+        <w:t>是否已有其他任务正在运行；如有，请先从悬浮窗或通知停止。</w:t>
       </w:r>
     </w:p>
     <w:p>
@@ -2634,12 +2688,12 @@
       </w:pPr>
       <w:r>
         <w:rPr>
-          <w:rFonts w:ascii="Aptos" w:hAnsi="Aptos" w:eastAsia="PingFang SC"/>
+          <w:rFonts w:ascii="Aptos" w:hAnsi="Aptos" w:eastAsia="Hiragino Sans GB"/>
           <w:b/>
           <w:color w:val="1F4E78"/>
           <w:sz w:val="26"/>
         </w:rPr>
-        <w:t>点击开始后没有打开大麦</w:t>
+        <w:t>保存配置后没有打开大麦</w:t>
       </w:r>
     </w:p>
     <w:p>
@@ -2648,11 +2702,11 @@
       </w:pPr>
       <w:r>
         <w:rPr>
-          <w:rFonts w:ascii="Aptos" w:hAnsi="Aptos" w:eastAsia="PingFang SC"/>
+          <w:rFonts w:ascii="Aptos" w:hAnsi="Aptos" w:eastAsia="Hiragino Sans GB"/>
           <w:color w:val="24292F"/>
           <w:sz w:val="21"/>
         </w:rPr>
-        <w:t>这是正常设计。请你自己打开或切换到大麦。</w:t>
+        <w:t>这是正常设计。请你自己打开或切换到大麦，再点击悬浮“开始”。</w:t>
       </w:r>
     </w:p>
     <w:p>
@@ -2662,12 +2716,12 @@
       </w:pPr>
       <w:r>
         <w:rPr>
-          <w:rFonts w:ascii="Aptos" w:hAnsi="Aptos" w:eastAsia="PingFang SC"/>
+          <w:rFonts w:ascii="Aptos" w:hAnsi="Aptos" w:eastAsia="Hiragino Sans GB"/>
           <w:b/>
           <w:color w:val="1F4E78"/>
           <w:sz w:val="26"/>
         </w:rPr>
-        <w:t>运行后很快暂停</w:t>
+        <w:t>点击悬浮“开始”后一直显示“识别中”</w:t>
       </w:r>
     </w:p>
     <w:p>
@@ -2676,11 +2730,11 @@
       </w:pPr>
       <w:r>
         <w:rPr>
-          <w:rFonts w:ascii="Aptos" w:hAnsi="Aptos" w:eastAsia="PingFang SC"/>
+          <w:rFonts w:ascii="Aptos" w:hAnsi="Aptos" w:eastAsia="Hiragino Sans GB"/>
           <w:color w:val="24292F"/>
           <w:sz w:val="21"/>
         </w:rPr>
-        <w:t>先看左上角提示。常见的可观察情况是：</w:t>
+        <w:t>先看左上角最新一条等待提示，再依次确认：</w:t>
       </w:r>
     </w:p>
     <w:p>
@@ -2690,7 +2744,7 @@
       </w:pPr>
       <w:r>
         <w:rPr>
-          <w:rFonts w:ascii="Aptos" w:hAnsi="Aptos" w:eastAsia="PingFang SC"/>
+          <w:rFonts w:ascii="Aptos" w:hAnsi="Aptos" w:eastAsia="Hiragino Sans GB"/>
           <w:b w:val="0"/>
           <w:color w:val="24292F"/>
           <w:sz w:val="21"/>
@@ -2699,11 +2753,18 @@
       </w:r>
       <w:r>
         <w:rPr>
-          <w:rFonts w:ascii="Aptos" w:hAnsi="Aptos" w:eastAsia="PingFang SC"/>
+          <w:rFonts w:ascii="Aptos" w:hAnsi="Aptos" w:eastAsia="Hiragino Sans GB"/>
           <w:color w:val="24292F"/>
           <w:sz w:val="21"/>
         </w:rPr>
-        <w:t>当前项目或场次和配置不一致。</w:t>
+      </w:r>
+      <w:r>
+        <w:rPr>
+          <w:rFonts w:ascii="Aptos" w:hAnsi="Aptos" w:eastAsia="Hiragino Sans GB"/>
+          <w:color w:val="24292F"/>
+          <w:sz w:val="21"/>
+        </w:rPr>
+        <w:t>当前前台页面是大麦，且是所选模式要求的项目详情页或场次票档页。</w:t>
       </w:r>
     </w:p>
     <w:p>
@@ -2713,7 +2774,7 @@
       </w:pPr>
       <w:r>
         <w:rPr>
-          <w:rFonts w:ascii="Aptos" w:hAnsi="Aptos" w:eastAsia="PingFang SC"/>
+          <w:rFonts w:ascii="Aptos" w:hAnsi="Aptos" w:eastAsia="Hiragino Sans GB"/>
           <w:b w:val="0"/>
           <w:color w:val="24292F"/>
           <w:sz w:val="21"/>
@@ -2722,11 +2783,18 @@
       </w:r>
       <w:r>
         <w:rPr>
-          <w:rFonts w:ascii="Aptos" w:hAnsi="Aptos" w:eastAsia="PingFang SC"/>
+          <w:rFonts w:ascii="Aptos" w:hAnsi="Aptos" w:eastAsia="Hiragino Sans GB"/>
           <w:color w:val="24292F"/>
           <w:sz w:val="21"/>
         </w:rPr>
-        <w:t>票档、价格或数量不一致。</w:t>
+      </w:r>
+      <w:r>
+        <w:rPr>
+          <w:rFonts w:ascii="Aptos" w:hAnsi="Aptos" w:eastAsia="Hiragino Sans GB"/>
+          <w:color w:val="24292F"/>
+          <w:sz w:val="21"/>
+        </w:rPr>
+        <w:t>页面日期与配置相同；完整年月日和中文“8月1日”可识别，无年份数字月日只接受双位“08-01”“08/01”“08.01”。“8-1”“8.1”、评分、版本号和价格不会被当作日期。</w:t>
       </w:r>
     </w:p>
     <w:p>
@@ -2736,7 +2804,7 @@
       </w:pPr>
       <w:r>
         <w:rPr>
-          <w:rFonts w:ascii="Aptos" w:hAnsi="Aptos" w:eastAsia="PingFang SC"/>
+          <w:rFonts w:ascii="Aptos" w:hAnsi="Aptos" w:eastAsia="Hiragino Sans GB"/>
           <w:b w:val="0"/>
           <w:color w:val="24292F"/>
           <w:sz w:val="21"/>
@@ -2745,11 +2813,18 @@
       </w:r>
       <w:r>
         <w:rPr>
-          <w:rFonts w:ascii="Aptos" w:hAnsi="Aptos" w:eastAsia="PingFang SC"/>
+          <w:rFonts w:ascii="Aptos" w:hAnsi="Aptos" w:eastAsia="Hiragino Sans GB"/>
           <w:color w:val="24292F"/>
           <w:sz w:val="21"/>
         </w:rPr>
-        <w:t>出现登录、验证码、风控、设备验证或未知弹窗。</w:t>
+      </w:r>
+      <w:r>
+        <w:rPr>
+          <w:rFonts w:ascii="Aptos" w:hAnsi="Aptos" w:eastAsia="Hiragino Sans GB"/>
+          <w:color w:val="24292F"/>
+          <w:sz w:val="21"/>
+        </w:rPr>
+        <w:t>页面票档价格与配置相同。</w:t>
       </w:r>
     </w:p>
     <w:p>
@@ -2759,7 +2834,7 @@
       </w:pPr>
       <w:r>
         <w:rPr>
-          <w:rFonts w:ascii="Aptos" w:hAnsi="Aptos" w:eastAsia="PingFang SC"/>
+          <w:rFonts w:ascii="Aptos" w:hAnsi="Aptos" w:eastAsia="Hiragino Sans GB"/>
           <w:b w:val="0"/>
           <w:color w:val="24292F"/>
           <w:sz w:val="21"/>
@@ -2768,11 +2843,18 @@
       </w:r>
       <w:r>
         <w:rPr>
-          <w:rFonts w:ascii="Aptos" w:hAnsi="Aptos" w:eastAsia="PingFang SC"/>
+          <w:rFonts w:ascii="Aptos" w:hAnsi="Aptos" w:eastAsia="Hiragino Sans GB"/>
           <w:color w:val="24292F"/>
           <w:sz w:val="21"/>
         </w:rPr>
-        <w:t>当前页面不是已经支持的大麦流程页面。</w:t>
+      </w:r>
+      <w:r>
+        <w:rPr>
+          <w:rFonts w:ascii="Aptos" w:hAnsi="Aptos" w:eastAsia="Hiragino Sans GB"/>
+          <w:color w:val="24292F"/>
+          <w:sz w:val="21"/>
+        </w:rPr>
+        <w:t>大麦页面已经加载完成，不是登录、验证码、风控或未知弹窗。</w:t>
       </w:r>
     </w:p>
     <w:p>
@@ -2781,11 +2863,11 @@
       </w:pPr>
       <w:r>
         <w:rPr>
-          <w:rFonts w:ascii="Aptos" w:hAnsi="Aptos" w:eastAsia="PingFang SC"/>
+          <w:rFonts w:ascii="Aptos" w:hAnsi="Aptos" w:eastAsia="Hiragino Sans GB"/>
           <w:color w:val="24292F"/>
           <w:sz w:val="21"/>
         </w:rPr>
-        <w:t>不要在不确定的页面强行继续，先停止任务并重新核对配置。</w:t>
+        <w:t>相同等待提示会被合并，不代表任务停止轮询。连续约 3 秒没有可读大麦窗口时会提示确认大麦在前台；核对后仍无法识别，请停止任务并记录日志。</w:t>
       </w:r>
     </w:p>
     <w:p>
@@ -2795,12 +2877,12 @@
       </w:pPr>
       <w:r>
         <w:rPr>
-          <w:rFonts w:ascii="Aptos" w:hAnsi="Aptos" w:eastAsia="PingFang SC"/>
+          <w:rFonts w:ascii="Aptos" w:hAnsi="Aptos" w:eastAsia="Hiragino Sans GB"/>
           <w:b/>
           <w:color w:val="1F4E78"/>
           <w:sz w:val="26"/>
         </w:rPr>
-        <w:t>重新安装后提示无障碍未开启</w:t>
+        <w:t>服务重绑或重新安装后</w:t>
       </w:r>
     </w:p>
     <w:p>
@@ -2809,11 +2891,11 @@
       </w:pPr>
       <w:r>
         <w:rPr>
-          <w:rFonts w:ascii="Aptos" w:hAnsi="Aptos" w:eastAsia="PingFang SC"/>
+          <w:rFonts w:ascii="Aptos" w:hAnsi="Aptos" w:eastAsia="Hiragino Sans GB"/>
           <w:color w:val="24292F"/>
           <w:sz w:val="21"/>
         </w:rPr>
-        <w:t>重新进入手机系统的无障碍设置，开启“购票辅助页面识别”。</w:t>
+        <w:t>系统回收并重新连接无障碍服务后，当前任务会继续识别，无需刷新大麦页面。重新安装后如显示未开启，请到系统无障碍设置重新开启“购票辅助页面识别”。</w:t>
       </w:r>
     </w:p>
     <w:p>
@@ -2823,7 +2905,7 @@
       </w:pPr>
       <w:r>
         <w:rPr>
-          <w:rFonts w:ascii="Aptos" w:hAnsi="Aptos" w:eastAsia="PingFang SC"/>
+          <w:rFonts w:ascii="Aptos" w:hAnsi="Aptos" w:eastAsia="Hiragino Sans GB"/>
           <w:b/>
           <w:color w:val="1F4E78"/>
           <w:sz w:val="32"/>
@@ -2838,7 +2920,7 @@
       </w:pPr>
       <w:r>
         <w:rPr>
-          <w:rFonts w:ascii="Aptos" w:hAnsi="Aptos" w:eastAsia="PingFang SC"/>
+          <w:rFonts w:ascii="Aptos" w:hAnsi="Aptos" w:eastAsia="Hiragino Sans GB"/>
           <w:b w:val="0"/>
           <w:color w:val="24292F"/>
           <w:sz w:val="21"/>
@@ -2847,7 +2929,7 @@
       </w:r>
       <w:r>
         <w:rPr>
-          <w:rFonts w:ascii="Aptos" w:hAnsi="Aptos" w:eastAsia="PingFang SC"/>
+          <w:rFonts w:ascii="Aptos" w:hAnsi="Aptos" w:eastAsia="Hiragino Sans GB"/>
           <w:color w:val="24292F"/>
           <w:sz w:val="21"/>
         </w:rPr>
@@ -2861,7 +2943,7 @@
       </w:pPr>
       <w:r>
         <w:rPr>
-          <w:rFonts w:ascii="Aptos" w:hAnsi="Aptos" w:eastAsia="PingFang SC"/>
+          <w:rFonts w:ascii="Aptos" w:hAnsi="Aptos" w:eastAsia="Hiragino Sans GB"/>
           <w:b w:val="0"/>
           <w:color w:val="24292F"/>
           <w:sz w:val="21"/>
@@ -2870,7 +2952,7 @@
       </w:r>
       <w:r>
         <w:rPr>
-          <w:rFonts w:ascii="Aptos" w:hAnsi="Aptos" w:eastAsia="PingFang SC"/>
+          <w:rFonts w:ascii="Aptos" w:hAnsi="Aptos" w:eastAsia="Hiragino Sans GB"/>
           <w:color w:val="24292F"/>
           <w:sz w:val="21"/>
         </w:rPr>
@@ -2884,7 +2966,7 @@
       </w:pPr>
       <w:r>
         <w:rPr>
-          <w:rFonts w:ascii="Aptos" w:hAnsi="Aptos" w:eastAsia="PingFang SC"/>
+          <w:rFonts w:ascii="Aptos" w:hAnsi="Aptos" w:eastAsia="Hiragino Sans GB"/>
           <w:b w:val="0"/>
           <w:color w:val="24292F"/>
           <w:sz w:val="21"/>
@@ -2893,11 +2975,11 @@
       </w:r>
       <w:r>
         <w:rPr>
-          <w:rFonts w:ascii="Aptos" w:hAnsi="Aptos" w:eastAsia="PingFang SC"/>
+          <w:rFonts w:ascii="Aptos" w:hAnsi="Aptos" w:eastAsia="Hiragino Sans GB"/>
           <w:color w:val="24292F"/>
           <w:sz w:val="21"/>
         </w:rPr>
-        <w:t>辅助中的场次、票档、价格和数量与大麦一致。</w:t>
+        <w:t>辅助中的演出日期和票档价格与大麦一致。</w:t>
       </w:r>
     </w:p>
     <w:p>
@@ -2907,7 +2989,7 @@
       </w:pPr>
       <w:r>
         <w:rPr>
-          <w:rFonts w:ascii="Aptos" w:hAnsi="Aptos" w:eastAsia="PingFang SC"/>
+          <w:rFonts w:ascii="Aptos" w:hAnsi="Aptos" w:eastAsia="Hiragino Sans GB"/>
           <w:b w:val="0"/>
           <w:color w:val="24292F"/>
           <w:sz w:val="21"/>
@@ -2916,7 +2998,7 @@
       </w:r>
       <w:r>
         <w:rPr>
-          <w:rFonts w:ascii="Aptos" w:hAnsi="Aptos" w:eastAsia="PingFang SC"/>
+          <w:rFonts w:ascii="Aptos" w:hAnsi="Aptos" w:eastAsia="Hiragino Sans GB"/>
           <w:color w:val="24292F"/>
           <w:sz w:val="21"/>
         </w:rPr>
@@ -2930,7 +3012,7 @@
       </w:pPr>
       <w:r>
         <w:rPr>
-          <w:rFonts w:ascii="Aptos" w:hAnsi="Aptos" w:eastAsia="PingFang SC"/>
+          <w:rFonts w:ascii="Aptos" w:hAnsi="Aptos" w:eastAsia="Hiragino Sans GB"/>
           <w:b w:val="0"/>
           <w:color w:val="24292F"/>
           <w:sz w:val="21"/>
@@ -2939,7 +3021,7 @@
       </w:r>
       <w:r>
         <w:rPr>
-          <w:rFonts w:ascii="Aptos" w:hAnsi="Aptos" w:eastAsia="PingFang SC"/>
+          <w:rFonts w:ascii="Aptos" w:hAnsi="Aptos" w:eastAsia="Hiragino Sans GB"/>
           <w:color w:val="24292F"/>
           <w:sz w:val="21"/>
         </w:rPr>
@@ -2953,7 +3035,7 @@
       </w:pPr>
       <w:r>
         <w:rPr>
-          <w:rFonts w:ascii="Aptos" w:hAnsi="Aptos" w:eastAsia="PingFang SC"/>
+          <w:rFonts w:ascii="Aptos" w:hAnsi="Aptos" w:eastAsia="Hiragino Sans GB"/>
           <w:b w:val="0"/>
           <w:color w:val="24292F"/>
           <w:sz w:val="21"/>
@@ -2962,11 +3044,11 @@
       </w:r>
       <w:r>
         <w:rPr>
-          <w:rFonts w:ascii="Aptos" w:hAnsi="Aptos" w:eastAsia="PingFang SC"/>
+          <w:rFonts w:ascii="Aptos" w:hAnsi="Aptos" w:eastAsia="Hiragino Sans GB"/>
           <w:color w:val="24292F"/>
           <w:sz w:val="21"/>
         </w:rPr>
-        <w:t>第一次测试的最大提交次数为 1。</w:t>
+        <w:t>我知道保存后还要打开大麦并点击悬浮“开始”。</w:t>
       </w:r>
     </w:p>
     <w:p>
@@ -2976,7 +3058,7 @@
       </w:pPr>
       <w:r>
         <w:rPr>
-          <w:rFonts w:ascii="Aptos" w:hAnsi="Aptos" w:eastAsia="PingFang SC"/>
+          <w:rFonts w:ascii="Aptos" w:hAnsi="Aptos" w:eastAsia="Hiragino Sans GB"/>
           <w:b w:val="0"/>
           <w:color w:val="24292F"/>
           <w:sz w:val="21"/>
@@ -2985,7 +3067,7 @@
       </w:r>
       <w:r>
         <w:rPr>
-          <w:rFonts w:ascii="Aptos" w:hAnsi="Aptos" w:eastAsia="PingFang SC"/>
+          <w:rFonts w:ascii="Aptos" w:hAnsi="Aptos" w:eastAsia="Hiragino Sans GB"/>
           <w:color w:val="24292F"/>
           <w:sz w:val="21"/>
         </w:rPr>
@@ -2999,7 +3081,7 @@
       </w:pPr>
       <w:r>
         <w:rPr>
-          <w:rFonts w:ascii="Aptos" w:hAnsi="Aptos" w:eastAsia="PingFang SC"/>
+          <w:rFonts w:ascii="Aptos" w:hAnsi="Aptos" w:eastAsia="Hiragino Sans GB"/>
           <w:b w:val="0"/>
           <w:color w:val="24292F"/>
           <w:sz w:val="21"/>
@@ -3008,7 +3090,7 @@
       </w:r>
       <w:r>
         <w:rPr>
-          <w:rFonts w:ascii="Aptos" w:hAnsi="Aptos" w:eastAsia="PingFang SC"/>
+          <w:rFonts w:ascii="Aptos" w:hAnsi="Aptos" w:eastAsia="Hiragino Sans GB"/>
           <w:color w:val="24292F"/>
           <w:sz w:val="21"/>
         </w:rPr>
@@ -3022,7 +3104,7 @@
       </w:pPr>
       <w:r>
         <w:rPr>
-          <w:rFonts w:ascii="Aptos" w:hAnsi="Aptos" w:eastAsia="PingFang SC"/>
+          <w:rFonts w:ascii="Aptos" w:hAnsi="Aptos" w:eastAsia="Hiragino Sans GB"/>
           <w:b/>
           <w:color w:val="1F4E78"/>
           <w:sz w:val="32"/>
@@ -3037,7 +3119,7 @@
       </w:pPr>
       <w:r>
         <w:rPr>
-          <w:rFonts w:ascii="Aptos" w:hAnsi="Aptos" w:eastAsia="PingFang SC"/>
+          <w:rFonts w:ascii="Aptos" w:hAnsi="Aptos" w:eastAsia="Hiragino Sans GB"/>
           <w:b/>
           <w:color w:val="1F4E78"/>
           <w:sz w:val="21"/>
@@ -3046,7 +3128,7 @@
       </w:r>
       <w:r>
         <w:rPr>
-          <w:rFonts w:ascii="Aptos" w:hAnsi="Aptos" w:eastAsia="PingFang SC"/>
+          <w:rFonts w:ascii="Aptos" w:hAnsi="Aptos" w:eastAsia="Hiragino Sans GB"/>
           <w:color w:val="24292F"/>
           <w:sz w:val="21"/>
         </w:rPr>
@@ -3060,7 +3142,7 @@
       </w:pPr>
       <w:r>
         <w:rPr>
-          <w:rFonts w:ascii="Aptos" w:hAnsi="Aptos" w:eastAsia="PingFang SC"/>
+          <w:rFonts w:ascii="Aptos" w:hAnsi="Aptos" w:eastAsia="Hiragino Sans GB"/>
           <w:b/>
           <w:color w:val="1F4E78"/>
           <w:sz w:val="21"/>
@@ -3069,7 +3151,7 @@
       </w:r>
       <w:r>
         <w:rPr>
-          <w:rFonts w:ascii="Aptos" w:hAnsi="Aptos" w:eastAsia="PingFang SC"/>
+          <w:rFonts w:ascii="Aptos" w:hAnsi="Aptos" w:eastAsia="Hiragino Sans GB"/>
           <w:color w:val="24292F"/>
           <w:sz w:val="21"/>
         </w:rPr>
@@ -3083,7 +3165,7 @@
       </w:pPr>
       <w:r>
         <w:rPr>
-          <w:rFonts w:ascii="Aptos" w:hAnsi="Aptos" w:eastAsia="PingFang SC"/>
+          <w:rFonts w:ascii="Aptos" w:hAnsi="Aptos" w:eastAsia="Hiragino Sans GB"/>
           <w:b/>
           <w:color w:val="1F4E78"/>
           <w:sz w:val="21"/>
@@ -3092,7 +3174,7 @@
       </w:r>
       <w:r>
         <w:rPr>
-          <w:rFonts w:ascii="Aptos" w:hAnsi="Aptos" w:eastAsia="PingFang SC"/>
+          <w:rFonts w:ascii="Aptos" w:hAnsi="Aptos" w:eastAsia="Hiragino Sans GB"/>
           <w:color w:val="24292F"/>
           <w:sz w:val="21"/>
         </w:rPr>
@@ -3106,7 +3188,7 @@
       </w:pPr>
       <w:r>
         <w:rPr>
-          <w:rFonts w:ascii="Aptos" w:hAnsi="Aptos" w:eastAsia="PingFang SC"/>
+          <w:rFonts w:ascii="Aptos" w:hAnsi="Aptos" w:eastAsia="Hiragino Sans GB"/>
           <w:b/>
           <w:color w:val="1F4E78"/>
           <w:sz w:val="21"/>
@@ -3115,7 +3197,7 @@
       </w:r>
       <w:r>
         <w:rPr>
-          <w:rFonts w:ascii="Aptos" w:hAnsi="Aptos" w:eastAsia="PingFang SC"/>
+          <w:rFonts w:ascii="Aptos" w:hAnsi="Aptos" w:eastAsia="Hiragino Sans GB"/>
           <w:color w:val="24292F"/>
           <w:sz w:val="21"/>
         </w:rPr>
@@ -3129,7 +3211,7 @@
       </w:pPr>
       <w:r>
         <w:rPr>
-          <w:rFonts w:ascii="Aptos" w:hAnsi="Aptos" w:eastAsia="PingFang SC"/>
+          <w:rFonts w:ascii="Aptos" w:hAnsi="Aptos" w:eastAsia="Hiragino Sans GB"/>
           <w:b/>
           <w:color w:val="1F4E78"/>
           <w:sz w:val="21"/>
@@ -3138,7 +3220,7 @@
       </w:r>
       <w:r>
         <w:rPr>
-          <w:rFonts w:ascii="Aptos" w:hAnsi="Aptos" w:eastAsia="PingFang SC"/>
+          <w:rFonts w:ascii="Aptos" w:hAnsi="Aptos" w:eastAsia="Hiragino Sans GB"/>
           <w:color w:val="24292F"/>
           <w:sz w:val="21"/>
         </w:rPr>
@@ -3152,7 +3234,7 @@
       </w:pPr>
       <w:r>
         <w:rPr>
-          <w:rFonts w:ascii="Aptos" w:hAnsi="Aptos" w:eastAsia="PingFang SC"/>
+          <w:rFonts w:ascii="Aptos" w:hAnsi="Aptos" w:eastAsia="Hiragino Sans GB"/>
           <w:b/>
           <w:color w:val="1F4E78"/>
           <w:sz w:val="21"/>
@@ -3161,7 +3243,7 @@
       </w:r>
       <w:r>
         <w:rPr>
-          <w:rFonts w:ascii="Aptos" w:hAnsi="Aptos" w:eastAsia="PingFang SC"/>
+          <w:rFonts w:ascii="Aptos" w:hAnsi="Aptos" w:eastAsia="Hiragino Sans GB"/>
           <w:color w:val="24292F"/>
           <w:sz w:val="21"/>
         </w:rPr>
@@ -3174,7 +3256,7 @@
       </w:pPr>
       <w:r>
         <w:rPr>
-          <w:rFonts w:ascii="Aptos" w:hAnsi="Aptos" w:eastAsia="PingFang SC"/>
+          <w:rFonts w:ascii="Aptos" w:hAnsi="Aptos" w:eastAsia="Hiragino Sans GB"/>
           <w:color w:val="24292F"/>
           <w:sz w:val="21"/>
         </w:rPr>
@@ -3188,7 +3270,7 @@
       </w:pPr>
       <w:r>
         <w:rPr>
-          <w:rFonts w:ascii="Aptos" w:hAnsi="Aptos" w:eastAsia="PingFang SC"/>
+          <w:rFonts w:ascii="Aptos" w:hAnsi="Aptos" w:eastAsia="Hiragino Sans GB"/>
           <w:b/>
           <w:color w:val="1F4E78"/>
           <w:sz w:val="32"/>
@@ -3202,28 +3284,11 @@
       </w:pPr>
       <w:r>
         <w:rPr>
-          <w:rFonts w:ascii="Aptos" w:hAnsi="Aptos" w:eastAsia="PingFang SC"/>
+          <w:rFonts w:ascii="Aptos" w:hAnsi="Aptos" w:eastAsia="Hiragino Sans GB"/>
           <w:color w:val="24292F"/>
           <w:sz w:val="21"/>
         </w:rPr>
-        <w:t xml:space="preserve">这是测试版本。真实流程可能生成待支付订单。首次使用请设置最大提交次数为 </w:t>
-      </w:r>
-      <w:r>
-        <w:rPr>
-          <w:rFonts w:ascii="Aptos" w:hAnsi="Aptos" w:eastAsia="Menlo"/>
-          <w:color w:val="9C2B2E"/>
-          <w:sz w:val="21"/>
-          <w:highlight/>
-        </w:rPr>
-        <w:t>1</w:t>
-      </w:r>
-      <w:r>
-        <w:rPr>
-          <w:rFonts w:ascii="Aptos" w:hAnsi="Aptos" w:eastAsia="PingFang SC"/>
-          <w:color w:val="24292F"/>
-          <w:sz w:val="21"/>
-        </w:rPr>
-        <w:t>， 并确保自己随时能点击“停止”。付款永远由你自己完成。</w:t>
+        <w:t>这是测试版本。真实流程可能生成待支付订单。请确保自己随时能点击“停止”，付款永远由你自己完成。</w:t>
       </w:r>
     </w:p>
     <w:sectPr>
@@ -3247,7 +3312,7 @@
     </w:pPr>
     <w:r>
       <w:rPr>
-        <w:rFonts w:ascii="Aptos" w:hAnsi="Aptos" w:eastAsia="PingFang SC"/>
+        <w:rFonts w:ascii="Aptos" w:hAnsi="Aptos" w:eastAsia="Hiragino Sans GB"/>
         <w:color w:val="57606A"/>
         <w:sz w:val="17"/>
       </w:rPr>
@@ -3260,7 +3325,7 @@
     </w:r>
     <w:r>
       <w:rPr>
-        <w:rFonts w:ascii="Aptos" w:hAnsi="Aptos" w:eastAsia="PingFang SC"/>
+        <w:rFonts w:ascii="Aptos" w:hAnsi="Aptos" w:eastAsia="Hiragino Sans GB"/>
         <w:color w:val="57606A"/>
         <w:sz w:val="17"/>
       </w:rPr>
@@ -3279,7 +3344,7 @@
     </w:pPr>
     <w:r>
       <w:rPr>
-        <w:rFonts w:ascii="Aptos" w:hAnsi="Aptos" w:eastAsia="PingFang SC"/>
+        <w:rFonts w:ascii="Aptos" w:hAnsi="Aptos" w:eastAsia="Hiragino Sans GB"/>
         <w:color w:val="57606A"/>
         <w:sz w:val="17"/>
       </w:rPr>
@@ -3653,7 +3718,7 @@
     <w:qFormat/>
     <w:rsid w:val="00FC693F"/>
     <w:rPr>
-      <w:rFonts w:ascii="Aptos" w:hAnsi="Aptos" w:eastAsia="PingFang SC"/>
+      <w:rFonts w:ascii="Aptos" w:hAnsi="Aptos" w:eastAsia="Hiragino Sans GB"/>
       <w:color w:val="24292F"/>
       <w:sz w:val="21"/>
     </w:rPr>
@@ -3717,7 +3782,7 @@
       <w:outlineLvl w:val="0"/>
     </w:pPr>
     <w:rPr>
-      <w:rFonts w:asciiTheme="majorHAnsi" w:eastAsiaTheme="majorEastAsia" w:hAnsiTheme="majorHAnsi" w:cstheme="majorBidi" w:ascii="Aptos" w:hAnsi="Aptos" w:eastAsia="PingFang SC"/>
+      <w:rFonts w:asciiTheme="majorHAnsi" w:eastAsiaTheme="majorEastAsia" w:hAnsiTheme="majorHAnsi" w:cstheme="majorBidi" w:ascii="Aptos" w:hAnsi="Aptos" w:eastAsia="Hiragino Sans GB"/>
       <w:b/>
       <w:bCs/>
       <w:color w:val="1F4E78"/>
@@ -3741,7 +3806,7 @@
       <w:outlineLvl w:val="1"/>
     </w:pPr>
     <w:rPr>
-      <w:rFonts w:asciiTheme="majorHAnsi" w:eastAsiaTheme="majorEastAsia" w:hAnsiTheme="majorHAnsi" w:cstheme="majorBidi" w:ascii="Aptos" w:hAnsi="Aptos" w:eastAsia="PingFang SC"/>
+      <w:rFonts w:asciiTheme="majorHAnsi" w:eastAsiaTheme="majorEastAsia" w:hAnsiTheme="majorHAnsi" w:cstheme="majorBidi" w:ascii="Aptos" w:hAnsi="Aptos" w:eastAsia="Hiragino Sans GB"/>
       <w:b/>
       <w:bCs/>
       <w:color w:val="1F4E78"/>
@@ -3765,7 +3830,7 @@
       <w:outlineLvl w:val="2"/>
     </w:pPr>
     <w:rPr>
-      <w:rFonts w:asciiTheme="majorHAnsi" w:eastAsiaTheme="majorEastAsia" w:hAnsiTheme="majorHAnsi" w:cstheme="majorBidi" w:ascii="Aptos" w:hAnsi="Aptos" w:eastAsia="PingFang SC"/>
+      <w:rFonts w:asciiTheme="majorHAnsi" w:eastAsiaTheme="majorEastAsia" w:hAnsiTheme="majorHAnsi" w:cstheme="majorBidi" w:ascii="Aptos" w:hAnsi="Aptos" w:eastAsia="Hiragino Sans GB"/>
       <w:b/>
       <w:bCs/>
       <w:color w:val="24292F"/>

</xml_diff>